<commit_message>
Add XMI generator/validator and refactor parser
Add a CLI entrypoint (generate.py) and a new validator (validator.py) to parse and validate UML XMI models. Refactor parser.py to add file existence and XML parse error checks, more robust datatype and attribute resolution (handles PrimitiveType/DataType, referenced IDs, href types, and direct types), strip/normalize names, and raise errors when no classes found. Rename test XMI files to remove spaces (Test models -> Test_models) and add contributor documentation files. Also include compiled __pycache__ artifacts.
</commit_message>
<xml_diff>
--- a/contributors documentation/UML PROJECT DOCUMENT.docx
+++ b/contributors documentation/UML PROJECT DOCUMENT.docx
@@ -3458,37 +3458,2313 @@
           <w:lang w:val="en-IN"/>
         </w:rPr>
         <w:pict w14:anchorId="75302EBA">
-          <v:rect id="_x0000_i1038" style="width:0;height:1.5pt" o:hralign="center" o:hrstd="t" o:hr="t" fillcolor="#a0a0a0" stroked="f"/>
+          <v:rect id="_x0000_i1041" style="width:0;height:1.5pt" o:hralign="center" o:bullet="t" o:hrstd="t" o:hr="t" fillcolor="#a0a0a0" stroked="f"/>
         </w:pict>
       </w:r>
     </w:p>
     <w:p>
       <w:pPr>
-        <w:pStyle w:val="Title"/>
-        <w:rPr>
-          <w:color w:val="EE0000"/>
-        </w:rPr>
-      </w:pPr>
+        <w:pStyle w:val="Heading1"/>
+        <w:rPr>
+          <w:rStyle w:val="SubtleEmphasis"/>
+        </w:rPr>
+      </w:pPr>
+      <w:r>
+        <w:rPr>
+          <w:rStyle w:val="SubtleEmphasis"/>
+        </w:rPr>
+        <w:lastRenderedPageBreak/>
+        <w:t>2</w:t>
+      </w:r>
+      <w:r>
+        <w:rPr>
+          <w:rStyle w:val="SubtleEmphasis"/>
+          <w:vertAlign w:val="superscript"/>
+        </w:rPr>
+        <w:t>nd</w:t>
+      </w:r>
+      <w:r>
+        <w:rPr>
+          <w:rStyle w:val="SubtleEmphasis"/>
+        </w:rPr>
+        <w:t xml:space="preserve"> Spiral</w:t>
+      </w:r>
+    </w:p>
+    <w:p>
+      <w:pPr>
+        <w:rPr>
+          <w:b/>
+          <w:bCs/>
+          <w:lang w:val="en-IN"/>
+        </w:rPr>
+      </w:pPr>
+      <w:r>
+        <w:rPr>
+          <w:rFonts w:ascii="Segoe UI Emoji" w:hAnsi="Segoe UI Emoji" w:cs="Segoe UI Emoji"/>
+          <w:b/>
+          <w:bCs/>
+          <w:lang w:val="en-IN"/>
+        </w:rPr>
+        <w:t>🎯</w:t>
+      </w:r>
+      <w:r>
+        <w:rPr>
+          <w:b/>
+          <w:bCs/>
+          <w:lang w:val="en-IN"/>
+        </w:rPr>
+        <w:t xml:space="preserve"> Objective of Spiral 2</w:t>
+      </w:r>
+    </w:p>
+    <w:p>
+      <w:pPr>
+        <w:rPr>
+          <w:lang w:val="en-IN"/>
+        </w:rPr>
+      </w:pPr>
+      <w:r>
+        <w:rPr>
+          <w:lang w:val="en-IN"/>
+        </w:rPr>
+        <w:t>Input:</w:t>
+      </w:r>
+    </w:p>
+    <w:p>
+      <w:pPr>
+        <w:rPr>
+          <w:lang w:val="en-IN"/>
+        </w:rPr>
+      </w:pPr>
+      <w:r>
+        <w:rPr>
+          <w:lang w:val="en-IN"/>
+        </w:rPr>
+        <w:t>{</w:t>
+      </w:r>
+    </w:p>
+    <w:p>
+      <w:pPr>
+        <w:rPr>
+          <w:lang w:val="en-IN"/>
+        </w:rPr>
+      </w:pPr>
+      <w:r>
+        <w:rPr>
+          <w:lang w:val="en-IN"/>
+        </w:rPr>
+        <w:t xml:space="preserve">  "classes": [</w:t>
+      </w:r>
+    </w:p>
+    <w:p>
+      <w:pPr>
+        <w:rPr>
+          <w:lang w:val="en-IN"/>
+        </w:rPr>
+      </w:pPr>
+      <w:r>
+        <w:rPr>
+          <w:lang w:val="en-IN"/>
+        </w:rPr>
+        <w:t xml:space="preserve">    {</w:t>
+      </w:r>
+    </w:p>
+    <w:p>
+      <w:pPr>
+        <w:rPr>
+          <w:lang w:val="en-IN"/>
+        </w:rPr>
+      </w:pPr>
+      <w:r>
+        <w:rPr>
+          <w:lang w:val="en-IN"/>
+        </w:rPr>
+        <w:t xml:space="preserve">      "name": "Student",</w:t>
+      </w:r>
+    </w:p>
+    <w:p>
+      <w:pPr>
+        <w:rPr>
+          <w:lang w:val="en-IN"/>
+        </w:rPr>
+      </w:pPr>
+      <w:r>
+        <w:rPr>
+          <w:lang w:val="en-IN"/>
+        </w:rPr>
+        <w:t xml:space="preserve">      "attributes": [</w:t>
+      </w:r>
+    </w:p>
+    <w:p>
+      <w:pPr>
+        <w:rPr>
+          <w:lang w:val="en-IN"/>
+        </w:rPr>
+      </w:pPr>
+      <w:r>
+        <w:rPr>
+          <w:lang w:val="en-IN"/>
+        </w:rPr>
+        <w:t xml:space="preserve">        {"name": "name", "type": "String"},</w:t>
+      </w:r>
+    </w:p>
+    <w:p>
+      <w:pPr>
+        <w:rPr>
+          <w:lang w:val="en-IN"/>
+        </w:rPr>
+      </w:pPr>
+      <w:r>
+        <w:rPr>
+          <w:lang w:val="en-IN"/>
+        </w:rPr>
+        <w:t xml:space="preserve">        {"name": "age", "type": "Integer"}</w:t>
+      </w:r>
+    </w:p>
+    <w:p>
+      <w:pPr>
+        <w:rPr>
+          <w:lang w:val="en-IN"/>
+        </w:rPr>
+      </w:pPr>
+      <w:r>
+        <w:rPr>
+          <w:lang w:val="en-IN"/>
+        </w:rPr>
+        <w:t xml:space="preserve">      ]</w:t>
+      </w:r>
+    </w:p>
+    <w:p>
+      <w:pPr>
+        <w:rPr>
+          <w:lang w:val="en-IN"/>
+        </w:rPr>
+      </w:pPr>
+      <w:r>
+        <w:rPr>
+          <w:lang w:val="en-IN"/>
+        </w:rPr>
+        <w:t xml:space="preserve">    }</w:t>
+      </w:r>
+    </w:p>
+    <w:p>
+      <w:pPr>
+        <w:rPr>
+          <w:lang w:val="en-IN"/>
+        </w:rPr>
+      </w:pPr>
+      <w:r>
+        <w:rPr>
+          <w:lang w:val="en-IN"/>
+        </w:rPr>
+        <w:t xml:space="preserve">  ]</w:t>
+      </w:r>
+    </w:p>
+    <w:p>
+      <w:pPr>
+        <w:rPr>
+          <w:lang w:val="en-IN"/>
+        </w:rPr>
+      </w:pPr>
+      <w:r>
+        <w:rPr>
+          <w:lang w:val="en-IN"/>
+        </w:rPr>
+        <w:t>}</w:t>
+      </w:r>
+    </w:p>
+    <w:p>
+      <w:pPr>
+        <w:rPr>
+          <w:lang w:val="en-IN"/>
+        </w:rPr>
+      </w:pPr>
+      <w:r>
+        <w:rPr>
+          <w:lang w:val="en-IN"/>
+        </w:rPr>
+        <w:t>Output:</w:t>
+      </w:r>
+    </w:p>
+    <w:p>
+      <w:pPr>
+        <w:rPr>
+          <w:lang w:val="en-IN"/>
+        </w:rPr>
+      </w:pPr>
+      <w:r>
+        <w:rPr>
+          <w:lang w:val="en-IN"/>
+        </w:rPr>
+        <w:t>CREATE TABLE Student (</w:t>
+      </w:r>
+    </w:p>
+    <w:p>
+      <w:pPr>
+        <w:rPr>
+          <w:lang w:val="en-IN"/>
+        </w:rPr>
+      </w:pPr>
+      <w:r>
+        <w:rPr>
+          <w:lang w:val="en-IN"/>
+        </w:rPr>
+        <w:t xml:space="preserve">    id INT AUTO_INCREMENT PRIMARY KEY,</w:t>
+      </w:r>
+    </w:p>
+    <w:p>
+      <w:pPr>
+        <w:rPr>
+          <w:lang w:val="en-IN"/>
+        </w:rPr>
+      </w:pPr>
+      <w:r>
+        <w:rPr>
+          <w:lang w:val="en-IN"/>
+        </w:rPr>
+        <w:t xml:space="preserve">    name </w:t>
+      </w:r>
       <w:proofErr w:type="gramStart"/>
       <w:r>
         <w:rPr>
-          <w:color w:val="EE0000"/>
-        </w:rPr>
-        <w:t>GET  TO</w:t>
+          <w:lang w:val="en-IN"/>
+        </w:rPr>
+        <w:t>VARCHAR(</w:t>
       </w:r>
       <w:proofErr w:type="gramEnd"/>
       <w:r>
         <w:rPr>
-          <w:color w:val="EE0000"/>
-        </w:rPr>
-        <w:t xml:space="preserve">  WORK</w:t>
-      </w:r>
-    </w:p>
+          <w:lang w:val="en-IN"/>
+        </w:rPr>
+        <w:t>255),</w:t>
+      </w:r>
+    </w:p>
+    <w:p>
+      <w:pPr>
+        <w:rPr>
+          <w:lang w:val="en-IN"/>
+        </w:rPr>
+      </w:pPr>
+      <w:r>
+        <w:rPr>
+          <w:lang w:val="en-IN"/>
+        </w:rPr>
+        <w:t xml:space="preserve">    age INT</w:t>
+      </w:r>
+    </w:p>
+    <w:p>
+      <w:pPr>
+        <w:rPr>
+          <w:lang w:val="en-IN"/>
+        </w:rPr>
+      </w:pPr>
+      <w:r>
+        <w:rPr>
+          <w:lang w:val="en-IN"/>
+        </w:rPr>
+        <w:t>);</w:t>
+      </w:r>
+    </w:p>
+    <w:p>
+      <w:pPr>
+        <w:rPr>
+          <w:lang w:val="en-IN"/>
+        </w:rPr>
+      </w:pPr>
+      <w:r>
+        <w:rPr>
+          <w:lang w:val="en-IN"/>
+        </w:rPr>
+        <w:pict w14:anchorId="69AA9ECD">
+          <v:rect id="_x0000_i1175" style="width:0;height:1.5pt" o:hralign="center" o:hrstd="t" o:hr="t" fillcolor="#a0a0a0" stroked="f"/>
+        </w:pict>
+      </w:r>
+    </w:p>
+    <w:p>
+      <w:pPr>
+        <w:rPr>
+          <w:b/>
+          <w:bCs/>
+          <w:lang w:val="en-IN"/>
+        </w:rPr>
+      </w:pPr>
+      <w:r>
+        <w:rPr>
+          <w:rFonts w:ascii="Segoe UI Emoji" w:hAnsi="Segoe UI Emoji" w:cs="Segoe UI Emoji"/>
+          <w:b/>
+          <w:bCs/>
+          <w:lang w:val="en-IN"/>
+        </w:rPr>
+        <w:t>👤</w:t>
+      </w:r>
+      <w:r>
+        <w:rPr>
+          <w:b/>
+          <w:bCs/>
+          <w:lang w:val="en-IN"/>
+        </w:rPr>
+        <w:t xml:space="preserve"> Member 1 – Data Type Mapping Designer</w:t>
+      </w:r>
+    </w:p>
+    <w:p>
+      <w:pPr>
+        <w:rPr>
+          <w:b/>
+          <w:bCs/>
+          <w:lang w:val="en-IN"/>
+        </w:rPr>
+      </w:pPr>
+      <w:r>
+        <w:rPr>
+          <w:b/>
+          <w:bCs/>
+          <w:lang w:val="en-IN"/>
+        </w:rPr>
+        <w:t>Responsibility:</w:t>
+      </w:r>
+    </w:p>
+    <w:p>
+      <w:pPr>
+        <w:rPr>
+          <w:lang w:val="en-IN"/>
+        </w:rPr>
+      </w:pPr>
+      <w:r>
+        <w:rPr>
+          <w:lang w:val="en-IN"/>
+        </w:rPr>
+        <w:t>Design and implement UML → MySQL type conversion logic.</w:t>
+      </w:r>
+    </w:p>
+    <w:p>
+      <w:pPr>
+        <w:rPr>
+          <w:b/>
+          <w:bCs/>
+          <w:lang w:val="en-IN"/>
+        </w:rPr>
+      </w:pPr>
+      <w:r>
+        <w:rPr>
+          <w:b/>
+          <w:bCs/>
+          <w:lang w:val="en-IN"/>
+        </w:rPr>
+        <w:t>Tasks:</w:t>
+      </w:r>
+    </w:p>
+    <w:p>
+      <w:pPr>
+        <w:numPr>
+          <w:ilvl w:val="0"/>
+          <w:numId w:val="76"/>
+        </w:numPr>
+        <w:rPr>
+          <w:lang w:val="en-IN"/>
+        </w:rPr>
+      </w:pPr>
+      <w:r>
+        <w:rPr>
+          <w:lang w:val="en-IN"/>
+        </w:rPr>
+        <w:t>Create mapping table:</w:t>
+      </w:r>
+    </w:p>
+    <w:p>
+      <w:pPr>
+        <w:numPr>
+          <w:ilvl w:val="1"/>
+          <w:numId w:val="76"/>
+        </w:numPr>
+        <w:rPr>
+          <w:lang w:val="en-IN"/>
+        </w:rPr>
+      </w:pPr>
+      <w:r>
+        <w:rPr>
+          <w:lang w:val="en-IN"/>
+        </w:rPr>
+        <w:t xml:space="preserve">String → </w:t>
+      </w:r>
+      <w:proofErr w:type="gramStart"/>
+      <w:r>
+        <w:rPr>
+          <w:lang w:val="en-IN"/>
+        </w:rPr>
+        <w:t>VARCHAR(</w:t>
+      </w:r>
+      <w:proofErr w:type="gramEnd"/>
+      <w:r>
+        <w:rPr>
+          <w:lang w:val="en-IN"/>
+        </w:rPr>
+        <w:t>255)</w:t>
+      </w:r>
+    </w:p>
+    <w:p>
+      <w:pPr>
+        <w:numPr>
+          <w:ilvl w:val="1"/>
+          <w:numId w:val="76"/>
+        </w:numPr>
+        <w:rPr>
+          <w:lang w:val="en-IN"/>
+        </w:rPr>
+      </w:pPr>
+      <w:r>
+        <w:rPr>
+          <w:lang w:val="en-IN"/>
+        </w:rPr>
+        <w:t>Integer → INT</w:t>
+      </w:r>
+    </w:p>
+    <w:p>
+      <w:pPr>
+        <w:numPr>
+          <w:ilvl w:val="1"/>
+          <w:numId w:val="76"/>
+        </w:numPr>
+        <w:rPr>
+          <w:lang w:val="en-IN"/>
+        </w:rPr>
+      </w:pPr>
+      <w:r>
+        <w:rPr>
+          <w:lang w:val="en-IN"/>
+        </w:rPr>
+        <w:lastRenderedPageBreak/>
+        <w:t xml:space="preserve">Boolean → </w:t>
+      </w:r>
+      <w:proofErr w:type="gramStart"/>
+      <w:r>
+        <w:rPr>
+          <w:lang w:val="en-IN"/>
+        </w:rPr>
+        <w:t>TINYINT(</w:t>
+      </w:r>
+      <w:proofErr w:type="gramEnd"/>
+      <w:r>
+        <w:rPr>
+          <w:lang w:val="en-IN"/>
+        </w:rPr>
+        <w:t>1)</w:t>
+      </w:r>
+    </w:p>
+    <w:p>
+      <w:pPr>
+        <w:numPr>
+          <w:ilvl w:val="1"/>
+          <w:numId w:val="76"/>
+        </w:numPr>
+        <w:rPr>
+          <w:lang w:val="en-IN"/>
+        </w:rPr>
+      </w:pPr>
+      <w:r>
+        <w:rPr>
+          <w:lang w:val="en-IN"/>
+        </w:rPr>
+        <w:t xml:space="preserve">Float → </w:t>
+      </w:r>
+      <w:proofErr w:type="gramStart"/>
+      <w:r>
+        <w:rPr>
+          <w:lang w:val="en-IN"/>
+        </w:rPr>
+        <w:t>DECIMAL(</w:t>
+      </w:r>
+      <w:proofErr w:type="gramEnd"/>
+      <w:r>
+        <w:rPr>
+          <w:lang w:val="en-IN"/>
+        </w:rPr>
+        <w:t>10,2)</w:t>
+      </w:r>
+    </w:p>
+    <w:p>
+      <w:pPr>
+        <w:numPr>
+          <w:ilvl w:val="1"/>
+          <w:numId w:val="76"/>
+        </w:numPr>
+        <w:rPr>
+          <w:lang w:val="en-IN"/>
+        </w:rPr>
+      </w:pPr>
+      <w:r>
+        <w:rPr>
+          <w:lang w:val="en-IN"/>
+        </w:rPr>
+        <w:t>Date → DATETIME</w:t>
+      </w:r>
+    </w:p>
+    <w:p>
+      <w:pPr>
+        <w:numPr>
+          <w:ilvl w:val="0"/>
+          <w:numId w:val="76"/>
+        </w:numPr>
+        <w:rPr>
+          <w:lang w:val="en-IN"/>
+        </w:rPr>
+      </w:pPr>
+      <w:r>
+        <w:rPr>
+          <w:lang w:val="en-IN"/>
+        </w:rPr>
+        <w:t>Handle:</w:t>
+      </w:r>
+    </w:p>
+    <w:p>
+      <w:pPr>
+        <w:numPr>
+          <w:ilvl w:val="1"/>
+          <w:numId w:val="76"/>
+        </w:numPr>
+        <w:rPr>
+          <w:lang w:val="en-IN"/>
+        </w:rPr>
+      </w:pPr>
+      <w:r>
+        <w:rPr>
+          <w:lang w:val="en-IN"/>
+        </w:rPr>
+        <w:t xml:space="preserve">Unknown types → default to </w:t>
+      </w:r>
+      <w:proofErr w:type="gramStart"/>
+      <w:r>
+        <w:rPr>
+          <w:lang w:val="en-IN"/>
+        </w:rPr>
+        <w:t>VARCHAR(</w:t>
+      </w:r>
+      <w:proofErr w:type="gramEnd"/>
+      <w:r>
+        <w:rPr>
+          <w:lang w:val="en-IN"/>
+        </w:rPr>
+        <w:t>255)</w:t>
+      </w:r>
+    </w:p>
+    <w:p>
+      <w:pPr>
+        <w:numPr>
+          <w:ilvl w:val="1"/>
+          <w:numId w:val="76"/>
+        </w:numPr>
+        <w:rPr>
+          <w:lang w:val="en-IN"/>
+        </w:rPr>
+      </w:pPr>
+      <w:r>
+        <w:rPr>
+          <w:lang w:val="en-IN"/>
+        </w:rPr>
+        <w:t>Log warning</w:t>
+      </w:r>
+    </w:p>
+    <w:p>
+      <w:pPr>
+        <w:numPr>
+          <w:ilvl w:val="0"/>
+          <w:numId w:val="76"/>
+        </w:numPr>
+        <w:rPr>
+          <w:lang w:val="en-IN"/>
+        </w:rPr>
+      </w:pPr>
+      <w:r>
+        <w:rPr>
+          <w:lang w:val="en-IN"/>
+        </w:rPr>
+        <w:t>Write:</w:t>
+      </w:r>
+      <w:r>
+        <w:rPr>
+          <w:lang w:val="en-IN"/>
+        </w:rPr>
+        <w:br/>
+        <w:t>type_mapper.py</w:t>
+      </w:r>
+    </w:p>
+    <w:p>
+      <w:pPr>
+        <w:numPr>
+          <w:ilvl w:val="0"/>
+          <w:numId w:val="76"/>
+        </w:numPr>
+        <w:rPr>
+          <w:lang w:val="en-IN"/>
+        </w:rPr>
+      </w:pPr>
+      <w:r>
+        <w:rPr>
+          <w:lang w:val="en-IN"/>
+        </w:rPr>
+        <w:t>Unit test:</w:t>
+      </w:r>
+    </w:p>
+    <w:p>
+      <w:pPr>
+        <w:numPr>
+          <w:ilvl w:val="1"/>
+          <w:numId w:val="76"/>
+        </w:numPr>
+        <w:rPr>
+          <w:lang w:val="en-IN"/>
+        </w:rPr>
+      </w:pPr>
+      <w:r>
+        <w:rPr>
+          <w:lang w:val="en-IN"/>
+        </w:rPr>
+        <w:t>Known types</w:t>
+      </w:r>
+    </w:p>
+    <w:p>
+      <w:pPr>
+        <w:numPr>
+          <w:ilvl w:val="1"/>
+          <w:numId w:val="76"/>
+        </w:numPr>
+        <w:rPr>
+          <w:lang w:val="en-IN"/>
+        </w:rPr>
+      </w:pPr>
+      <w:r>
+        <w:rPr>
+          <w:lang w:val="en-IN"/>
+        </w:rPr>
+        <w:t>Unknown type</w:t>
+      </w:r>
+    </w:p>
+    <w:p>
+      <w:pPr>
+        <w:numPr>
+          <w:ilvl w:val="1"/>
+          <w:numId w:val="76"/>
+        </w:numPr>
+        <w:rPr>
+          <w:lang w:val="en-IN"/>
+        </w:rPr>
+      </w:pPr>
+      <w:r>
+        <w:rPr>
+          <w:lang w:val="en-IN"/>
+        </w:rPr>
+        <w:t>Case sensitivity</w:t>
+      </w:r>
+    </w:p>
+    <w:p>
+      <w:pPr>
+        <w:rPr>
+          <w:b/>
+          <w:bCs/>
+          <w:lang w:val="en-IN"/>
+        </w:rPr>
+      </w:pPr>
+      <w:r>
+        <w:rPr>
+          <w:b/>
+          <w:bCs/>
+          <w:lang w:val="en-IN"/>
+        </w:rPr>
+        <w:t>Deliverable:</w:t>
+      </w:r>
+    </w:p>
+    <w:p>
+      <w:pPr>
+        <w:rPr>
+          <w:lang w:val="en-IN"/>
+        </w:rPr>
+      </w:pPr>
+      <w:r>
+        <w:rPr>
+          <w:lang w:val="en-IN"/>
+        </w:rPr>
+        <w:t>Reusable function:</w:t>
+      </w:r>
+    </w:p>
+    <w:p>
+      <w:pPr>
+        <w:rPr>
+          <w:lang w:val="en-IN"/>
+        </w:rPr>
+      </w:pPr>
+      <w:proofErr w:type="spellStart"/>
+      <w:r>
+        <w:rPr>
+          <w:lang w:val="en-IN"/>
+        </w:rPr>
+        <w:t>map_type</w:t>
+      </w:r>
+      <w:proofErr w:type="spellEnd"/>
+      <w:r>
+        <w:rPr>
+          <w:lang w:val="en-IN"/>
+        </w:rPr>
+        <w:t>("String") → "</w:t>
+      </w:r>
+      <w:proofErr w:type="gramStart"/>
+      <w:r>
+        <w:rPr>
+          <w:lang w:val="en-IN"/>
+        </w:rPr>
+        <w:t>VARCHAR(</w:t>
+      </w:r>
+      <w:proofErr w:type="gramEnd"/>
+      <w:r>
+        <w:rPr>
+          <w:lang w:val="en-IN"/>
+        </w:rPr>
+        <w:t>255)"</w:t>
+      </w:r>
+    </w:p>
+    <w:p>
+      <w:pPr>
+        <w:rPr>
+          <w:lang w:val="en-IN"/>
+        </w:rPr>
+      </w:pPr>
+      <w:r>
+        <w:rPr>
+          <w:lang w:val="en-IN"/>
+        </w:rPr>
+        <w:t>This module must be clean and isolated.</w:t>
+      </w:r>
+    </w:p>
+    <w:p>
+      <w:pPr>
+        <w:rPr>
+          <w:lang w:val="en-IN"/>
+        </w:rPr>
+      </w:pPr>
+      <w:r>
+        <w:rPr>
+          <w:lang w:val="en-IN"/>
+        </w:rPr>
+        <w:pict w14:anchorId="474AE0A4">
+          <v:rect id="_x0000_i1177" style="width:0;height:1.5pt" o:hralign="center" o:hrstd="t" o:hr="t" fillcolor="#a0a0a0" stroked="f"/>
+        </w:pict>
+      </w:r>
+    </w:p>
+    <w:p>
+      <w:pPr>
+        <w:rPr>
+          <w:b/>
+          <w:bCs/>
+          <w:lang w:val="en-IN"/>
+        </w:rPr>
+      </w:pPr>
+      <w:r>
+        <w:rPr>
+          <w:rFonts w:ascii="Segoe UI Emoji" w:hAnsi="Segoe UI Emoji" w:cs="Segoe UI Emoji"/>
+          <w:b/>
+          <w:bCs/>
+          <w:lang w:val="en-IN"/>
+        </w:rPr>
+        <w:t>👤</w:t>
+      </w:r>
+      <w:r>
+        <w:rPr>
+          <w:b/>
+          <w:bCs/>
+          <w:lang w:val="en-IN"/>
+        </w:rPr>
+        <w:t xml:space="preserve"> Member 2 – Table Generator Developer</w:t>
+      </w:r>
+    </w:p>
+    <w:p>
+      <w:pPr>
+        <w:rPr>
+          <w:b/>
+          <w:bCs/>
+          <w:lang w:val="en-IN"/>
+        </w:rPr>
+      </w:pPr>
+      <w:r>
+        <w:rPr>
+          <w:b/>
+          <w:bCs/>
+          <w:lang w:val="en-IN"/>
+        </w:rPr>
+        <w:t>Responsibility:</w:t>
+      </w:r>
+    </w:p>
+    <w:p>
+      <w:pPr>
+        <w:rPr>
+          <w:lang w:val="en-IN"/>
+        </w:rPr>
+      </w:pPr>
+      <w:r>
+        <w:rPr>
+          <w:lang w:val="en-IN"/>
+        </w:rPr>
+        <w:t>Convert class object → SQL CREATE TABLE statement.</w:t>
+      </w:r>
+    </w:p>
+    <w:p>
+      <w:pPr>
+        <w:rPr>
+          <w:b/>
+          <w:bCs/>
+          <w:lang w:val="en-IN"/>
+        </w:rPr>
+      </w:pPr>
+      <w:r>
+        <w:rPr>
+          <w:b/>
+          <w:bCs/>
+          <w:lang w:val="en-IN"/>
+        </w:rPr>
+        <w:t>Tasks:</w:t>
+      </w:r>
+    </w:p>
+    <w:p>
+      <w:pPr>
+        <w:numPr>
+          <w:ilvl w:val="0"/>
+          <w:numId w:val="77"/>
+        </w:numPr>
+        <w:rPr>
+          <w:lang w:val="en-IN"/>
+        </w:rPr>
+      </w:pPr>
+      <w:r>
+        <w:rPr>
+          <w:lang w:val="en-IN"/>
+        </w:rPr>
+        <w:t>Write logic:</w:t>
+      </w:r>
+    </w:p>
+    <w:p>
+      <w:pPr>
+        <w:numPr>
+          <w:ilvl w:val="1"/>
+          <w:numId w:val="77"/>
+        </w:numPr>
+        <w:rPr>
+          <w:lang w:val="en-IN"/>
+        </w:rPr>
+      </w:pPr>
+      <w:r>
+        <w:rPr>
+          <w:lang w:val="en-IN"/>
+        </w:rPr>
+        <w:t>Loop over classes</w:t>
+      </w:r>
+    </w:p>
+    <w:p>
+      <w:pPr>
+        <w:numPr>
+          <w:ilvl w:val="1"/>
+          <w:numId w:val="77"/>
+        </w:numPr>
+        <w:rPr>
+          <w:lang w:val="en-IN"/>
+        </w:rPr>
+      </w:pPr>
+      <w:r>
+        <w:rPr>
+          <w:lang w:val="en-IN"/>
+        </w:rPr>
+        <w:t>Add id INT AUTO_INCREMENT PRIMARY KEY</w:t>
+      </w:r>
+    </w:p>
+    <w:p>
+      <w:pPr>
+        <w:numPr>
+          <w:ilvl w:val="1"/>
+          <w:numId w:val="77"/>
+        </w:numPr>
+        <w:rPr>
+          <w:lang w:val="en-IN"/>
+        </w:rPr>
+      </w:pPr>
+      <w:r>
+        <w:rPr>
+          <w:lang w:val="en-IN"/>
+        </w:rPr>
+        <w:t xml:space="preserve">Add attribute columns using </w:t>
+      </w:r>
+      <w:proofErr w:type="spellStart"/>
+      <w:r>
+        <w:rPr>
+          <w:lang w:val="en-IN"/>
+        </w:rPr>
+        <w:t>type_mapper</w:t>
+      </w:r>
+      <w:proofErr w:type="spellEnd"/>
+    </w:p>
+    <w:p>
+      <w:pPr>
+        <w:numPr>
+          <w:ilvl w:val="1"/>
+          <w:numId w:val="77"/>
+        </w:numPr>
+        <w:rPr>
+          <w:lang w:val="en-IN"/>
+        </w:rPr>
+      </w:pPr>
+      <w:r>
+        <w:rPr>
+          <w:lang w:val="en-IN"/>
+        </w:rPr>
+        <w:t>Generate proper SQL syntax</w:t>
+      </w:r>
+    </w:p>
+    <w:p>
+      <w:pPr>
+        <w:numPr>
+          <w:ilvl w:val="1"/>
+          <w:numId w:val="77"/>
+        </w:numPr>
+        <w:rPr>
+          <w:lang w:val="en-IN"/>
+        </w:rPr>
+      </w:pPr>
+      <w:r>
+        <w:rPr>
+          <w:lang w:val="en-IN"/>
+        </w:rPr>
+        <w:t>Handle comma placement properly</w:t>
+      </w:r>
+    </w:p>
+    <w:p>
+      <w:pPr>
+        <w:numPr>
+          <w:ilvl w:val="0"/>
+          <w:numId w:val="77"/>
+        </w:numPr>
+        <w:rPr>
+          <w:lang w:val="en-IN"/>
+        </w:rPr>
+      </w:pPr>
+      <w:r>
+        <w:rPr>
+          <w:lang w:val="en-IN"/>
+        </w:rPr>
+        <w:t>Ensure:</w:t>
+      </w:r>
+    </w:p>
+    <w:p>
+      <w:pPr>
+        <w:numPr>
+          <w:ilvl w:val="1"/>
+          <w:numId w:val="77"/>
+        </w:numPr>
+        <w:rPr>
+          <w:lang w:val="en-IN"/>
+        </w:rPr>
+      </w:pPr>
+      <w:r>
+        <w:rPr>
+          <w:lang w:val="en-IN"/>
+        </w:rPr>
+        <w:t>Table name matches class name</w:t>
+      </w:r>
+    </w:p>
+    <w:p>
+      <w:pPr>
+        <w:numPr>
+          <w:ilvl w:val="1"/>
+          <w:numId w:val="77"/>
+        </w:numPr>
+        <w:rPr>
+          <w:lang w:val="en-IN"/>
+        </w:rPr>
+      </w:pPr>
+      <w:r>
+        <w:rPr>
+          <w:lang w:val="en-IN"/>
+        </w:rPr>
+        <w:lastRenderedPageBreak/>
+        <w:t>No trailing commas</w:t>
+      </w:r>
+    </w:p>
+    <w:p>
+      <w:pPr>
+        <w:numPr>
+          <w:ilvl w:val="1"/>
+          <w:numId w:val="77"/>
+        </w:numPr>
+        <w:rPr>
+          <w:lang w:val="en-IN"/>
+        </w:rPr>
+      </w:pPr>
+      <w:r>
+        <w:rPr>
+          <w:lang w:val="en-IN"/>
+        </w:rPr>
+        <w:t>Valid SQL formatting</w:t>
+      </w:r>
+    </w:p>
+    <w:p>
+      <w:pPr>
+        <w:numPr>
+          <w:ilvl w:val="0"/>
+          <w:numId w:val="77"/>
+        </w:numPr>
+        <w:rPr>
+          <w:lang w:val="en-IN"/>
+        </w:rPr>
+      </w:pPr>
+      <w:r>
+        <w:rPr>
+          <w:lang w:val="en-IN"/>
+        </w:rPr>
+        <w:t>Output:</w:t>
+      </w:r>
+      <w:r>
+        <w:rPr>
+          <w:lang w:val="en-IN"/>
+        </w:rPr>
+        <w:br/>
+      </w:r>
+      <w:proofErr w:type="spellStart"/>
+      <w:r>
+        <w:rPr>
+          <w:lang w:val="en-IN"/>
+        </w:rPr>
+        <w:t>schema.sql</w:t>
+      </w:r>
+      <w:proofErr w:type="spellEnd"/>
+    </w:p>
+    <w:p>
+      <w:pPr>
+        <w:rPr>
+          <w:b/>
+          <w:bCs/>
+          <w:lang w:val="en-IN"/>
+        </w:rPr>
+      </w:pPr>
+      <w:r>
+        <w:rPr>
+          <w:b/>
+          <w:bCs/>
+          <w:lang w:val="en-IN"/>
+        </w:rPr>
+        <w:t>Deliverable:</w:t>
+      </w:r>
+    </w:p>
+    <w:p>
+      <w:pPr>
+        <w:rPr>
+          <w:lang w:val="en-IN"/>
+        </w:rPr>
+      </w:pPr>
+      <w:r>
+        <w:rPr>
+          <w:lang w:val="en-IN"/>
+        </w:rPr>
+        <w:t>Working schema_generator.py</w:t>
+      </w:r>
+    </w:p>
+    <w:p>
+      <w:pPr>
+        <w:rPr>
+          <w:lang w:val="en-IN"/>
+        </w:rPr>
+      </w:pPr>
+      <w:r>
+        <w:rPr>
+          <w:lang w:val="en-IN"/>
+        </w:rPr>
+        <w:pict w14:anchorId="1E98C46E">
+          <v:rect id="_x0000_i1178" style="width:0;height:1.5pt" o:hralign="center" o:hrstd="t" o:hr="t" fillcolor="#a0a0a0" stroked="f"/>
+        </w:pict>
+      </w:r>
+    </w:p>
+    <w:p>
+      <w:pPr>
+        <w:rPr>
+          <w:b/>
+          <w:bCs/>
+          <w:lang w:val="en-IN"/>
+        </w:rPr>
+      </w:pPr>
+      <w:r>
+        <w:rPr>
+          <w:rFonts w:ascii="Segoe UI Emoji" w:hAnsi="Segoe UI Emoji" w:cs="Segoe UI Emoji"/>
+          <w:b/>
+          <w:bCs/>
+          <w:lang w:val="en-IN"/>
+        </w:rPr>
+        <w:t>👤</w:t>
+      </w:r>
+      <w:r>
+        <w:rPr>
+          <w:b/>
+          <w:bCs/>
+          <w:lang w:val="en-IN"/>
+        </w:rPr>
+        <w:t xml:space="preserve"> Member 3 – SQL Validation &amp; Constraint Handler</w:t>
+      </w:r>
+    </w:p>
+    <w:p>
+      <w:pPr>
+        <w:rPr>
+          <w:b/>
+          <w:bCs/>
+          <w:lang w:val="en-IN"/>
+        </w:rPr>
+      </w:pPr>
+      <w:r>
+        <w:rPr>
+          <w:b/>
+          <w:bCs/>
+          <w:lang w:val="en-IN"/>
+        </w:rPr>
+        <w:t>Responsibility:</w:t>
+      </w:r>
+    </w:p>
+    <w:p>
+      <w:pPr>
+        <w:rPr>
+          <w:lang w:val="en-IN"/>
+        </w:rPr>
+      </w:pPr>
+      <w:r>
+        <w:rPr>
+          <w:lang w:val="en-IN"/>
+        </w:rPr>
+        <w:t>Improve schema robustness.</w:t>
+      </w:r>
+    </w:p>
+    <w:p>
+      <w:pPr>
+        <w:rPr>
+          <w:b/>
+          <w:bCs/>
+          <w:lang w:val="en-IN"/>
+        </w:rPr>
+      </w:pPr>
+      <w:r>
+        <w:rPr>
+          <w:b/>
+          <w:bCs/>
+          <w:lang w:val="en-IN"/>
+        </w:rPr>
+        <w:t>Tasks:</w:t>
+      </w:r>
+    </w:p>
+    <w:p>
+      <w:pPr>
+        <w:numPr>
+          <w:ilvl w:val="0"/>
+          <w:numId w:val="78"/>
+        </w:numPr>
+        <w:rPr>
+          <w:lang w:val="en-IN"/>
+        </w:rPr>
+      </w:pPr>
+      <w:r>
+        <w:rPr>
+          <w:lang w:val="en-IN"/>
+        </w:rPr>
+        <w:t>Add:</w:t>
+      </w:r>
+    </w:p>
+    <w:p>
+      <w:pPr>
+        <w:numPr>
+          <w:ilvl w:val="1"/>
+          <w:numId w:val="78"/>
+        </w:numPr>
+        <w:rPr>
+          <w:lang w:val="en-IN"/>
+        </w:rPr>
+      </w:pPr>
+      <w:r>
+        <w:rPr>
+          <w:lang w:val="en-IN"/>
+        </w:rPr>
+        <w:t>NOT NULL if required (if your model supports it)</w:t>
+      </w:r>
+    </w:p>
+    <w:p>
+      <w:pPr>
+        <w:numPr>
+          <w:ilvl w:val="1"/>
+          <w:numId w:val="78"/>
+        </w:numPr>
+        <w:rPr>
+          <w:lang w:val="en-IN"/>
+        </w:rPr>
+      </w:pPr>
+      <w:r>
+        <w:rPr>
+          <w:lang w:val="en-IN"/>
+        </w:rPr>
+        <w:t>Basic constraints if defined</w:t>
+      </w:r>
+    </w:p>
+    <w:p>
+      <w:pPr>
+        <w:numPr>
+          <w:ilvl w:val="0"/>
+          <w:numId w:val="78"/>
+        </w:numPr>
+        <w:rPr>
+          <w:lang w:val="en-IN"/>
+        </w:rPr>
+      </w:pPr>
+      <w:r>
+        <w:rPr>
+          <w:lang w:val="en-IN"/>
+        </w:rPr>
+        <w:t>Validate:</w:t>
+      </w:r>
+    </w:p>
+    <w:p>
+      <w:pPr>
+        <w:numPr>
+          <w:ilvl w:val="1"/>
+          <w:numId w:val="78"/>
+        </w:numPr>
+        <w:rPr>
+          <w:lang w:val="en-IN"/>
+        </w:rPr>
+      </w:pPr>
+      <w:r>
+        <w:rPr>
+          <w:lang w:val="en-IN"/>
+        </w:rPr>
+        <w:t>No duplicate column names</w:t>
+      </w:r>
+    </w:p>
+    <w:p>
+      <w:pPr>
+        <w:numPr>
+          <w:ilvl w:val="1"/>
+          <w:numId w:val="78"/>
+        </w:numPr>
+        <w:rPr>
+          <w:lang w:val="en-IN"/>
+        </w:rPr>
+      </w:pPr>
+      <w:r>
+        <w:rPr>
+          <w:lang w:val="en-IN"/>
+        </w:rPr>
+        <w:t>SQL keyword conflicts (e.g., table named "Order")</w:t>
+      </w:r>
+    </w:p>
+    <w:p>
+      <w:pPr>
+        <w:numPr>
+          <w:ilvl w:val="0"/>
+          <w:numId w:val="78"/>
+        </w:numPr>
+        <w:rPr>
+          <w:lang w:val="en-IN"/>
+        </w:rPr>
+      </w:pPr>
+      <w:r>
+        <w:rPr>
+          <w:lang w:val="en-IN"/>
+        </w:rPr>
+        <w:t>Test:</w:t>
+      </w:r>
+    </w:p>
+    <w:p>
+      <w:pPr>
+        <w:numPr>
+          <w:ilvl w:val="1"/>
+          <w:numId w:val="78"/>
+        </w:numPr>
+        <w:rPr>
+          <w:lang w:val="en-IN"/>
+        </w:rPr>
+      </w:pPr>
+      <w:r>
+        <w:rPr>
+          <w:lang w:val="en-IN"/>
+        </w:rPr>
+        <w:t>Run generated SQL in MySQL</w:t>
+      </w:r>
+    </w:p>
+    <w:p>
+      <w:pPr>
+        <w:numPr>
+          <w:ilvl w:val="1"/>
+          <w:numId w:val="78"/>
+        </w:numPr>
+        <w:rPr>
+          <w:lang w:val="en-IN"/>
+        </w:rPr>
+      </w:pPr>
+      <w:r>
+        <w:rPr>
+          <w:lang w:val="en-IN"/>
+        </w:rPr>
+        <w:t>Check errors</w:t>
+      </w:r>
+    </w:p>
+    <w:p>
+      <w:pPr>
+        <w:numPr>
+          <w:ilvl w:val="1"/>
+          <w:numId w:val="78"/>
+        </w:numPr>
+        <w:rPr>
+          <w:lang w:val="en-IN"/>
+        </w:rPr>
+      </w:pPr>
+      <w:r>
+        <w:rPr>
+          <w:lang w:val="en-IN"/>
+        </w:rPr>
+        <w:t>Document issues</w:t>
+      </w:r>
+    </w:p>
+    <w:p>
+      <w:pPr>
+        <w:numPr>
+          <w:ilvl w:val="0"/>
+          <w:numId w:val="78"/>
+        </w:numPr>
+        <w:rPr>
+          <w:lang w:val="en-IN"/>
+        </w:rPr>
+      </w:pPr>
+      <w:r>
+        <w:rPr>
+          <w:lang w:val="en-IN"/>
+        </w:rPr>
+        <w:t>Improve formatting readability</w:t>
+      </w:r>
+    </w:p>
+    <w:p>
+      <w:pPr>
+        <w:rPr>
+          <w:b/>
+          <w:bCs/>
+          <w:lang w:val="en-IN"/>
+        </w:rPr>
+      </w:pPr>
+      <w:r>
+        <w:rPr>
+          <w:b/>
+          <w:bCs/>
+          <w:lang w:val="en-IN"/>
+        </w:rPr>
+        <w:t>Deliverable:</w:t>
+      </w:r>
+    </w:p>
+    <w:p>
+      <w:pPr>
+        <w:rPr>
+          <w:lang w:val="en-IN"/>
+        </w:rPr>
+      </w:pPr>
+      <w:r>
+        <w:rPr>
+          <w:lang w:val="en-IN"/>
+        </w:rPr>
+        <w:t>Validated schema that runs without SQL errors.</w:t>
+      </w:r>
+    </w:p>
+    <w:p>
+      <w:pPr>
+        <w:rPr>
+          <w:lang w:val="en-IN"/>
+        </w:rPr>
+      </w:pPr>
+      <w:r>
+        <w:rPr>
+          <w:lang w:val="en-IN"/>
+        </w:rPr>
+        <w:pict w14:anchorId="65B4630F">
+          <v:rect id="_x0000_i1179" style="width:0;height:1.5pt" o:hralign="center" o:hrstd="t" o:hr="t" fillcolor="#a0a0a0" stroked="f"/>
+        </w:pict>
+      </w:r>
+    </w:p>
+    <w:p>
+      <w:pPr>
+        <w:rPr>
+          <w:b/>
+          <w:bCs/>
+          <w:lang w:val="en-IN"/>
+        </w:rPr>
+      </w:pPr>
+      <w:r>
+        <w:rPr>
+          <w:rFonts w:ascii="Segoe UI Emoji" w:hAnsi="Segoe UI Emoji" w:cs="Segoe UI Emoji"/>
+          <w:b/>
+          <w:bCs/>
+          <w:lang w:val="en-IN"/>
+        </w:rPr>
+        <w:t>👤</w:t>
+      </w:r>
+      <w:r>
+        <w:rPr>
+          <w:b/>
+          <w:bCs/>
+          <w:lang w:val="en-IN"/>
+        </w:rPr>
+        <w:t xml:space="preserve"> Member 4 – Integration &amp; Architecture Control</w:t>
+      </w:r>
+    </w:p>
+    <w:p>
+      <w:pPr>
+        <w:rPr>
+          <w:b/>
+          <w:bCs/>
+          <w:lang w:val="en-IN"/>
+        </w:rPr>
+      </w:pPr>
+      <w:r>
+        <w:rPr>
+          <w:b/>
+          <w:bCs/>
+          <w:lang w:val="en-IN"/>
+        </w:rPr>
+        <w:t>Responsibility:</w:t>
+      </w:r>
+    </w:p>
+    <w:p>
+      <w:pPr>
+        <w:rPr>
+          <w:lang w:val="en-IN"/>
+        </w:rPr>
+      </w:pPr>
+      <w:r>
+        <w:rPr>
+          <w:lang w:val="en-IN"/>
+        </w:rPr>
+        <w:t>System-level integration + quality control.</w:t>
+      </w:r>
+    </w:p>
+    <w:p>
+      <w:pPr>
+        <w:rPr>
+          <w:b/>
+          <w:bCs/>
+          <w:lang w:val="en-IN"/>
+        </w:rPr>
+      </w:pPr>
+      <w:r>
+        <w:rPr>
+          <w:b/>
+          <w:bCs/>
+          <w:lang w:val="en-IN"/>
+        </w:rPr>
+        <w:t>Tasks:</w:t>
+      </w:r>
+    </w:p>
+    <w:p>
+      <w:pPr>
+        <w:numPr>
+          <w:ilvl w:val="0"/>
+          <w:numId w:val="79"/>
+        </w:numPr>
+        <w:rPr>
+          <w:lang w:val="en-IN"/>
+        </w:rPr>
+      </w:pPr>
+      <w:r>
+        <w:rPr>
+          <w:lang w:val="en-IN"/>
+        </w:rPr>
+        <w:lastRenderedPageBreak/>
+        <w:t>Integrate:</w:t>
+      </w:r>
+    </w:p>
+    <w:p>
+      <w:pPr>
+        <w:numPr>
+          <w:ilvl w:val="1"/>
+          <w:numId w:val="79"/>
+        </w:numPr>
+        <w:rPr>
+          <w:lang w:val="en-IN"/>
+        </w:rPr>
+      </w:pPr>
+      <w:r>
+        <w:rPr>
+          <w:lang w:val="en-IN"/>
+        </w:rPr>
+        <w:t>parser output</w:t>
+      </w:r>
+    </w:p>
+    <w:p>
+      <w:pPr>
+        <w:numPr>
+          <w:ilvl w:val="1"/>
+          <w:numId w:val="79"/>
+        </w:numPr>
+        <w:rPr>
+          <w:lang w:val="en-IN"/>
+        </w:rPr>
+      </w:pPr>
+      <w:r>
+        <w:rPr>
+          <w:lang w:val="en-IN"/>
+        </w:rPr>
+        <w:t>validation layer</w:t>
+      </w:r>
+    </w:p>
+    <w:p>
+      <w:pPr>
+        <w:numPr>
+          <w:ilvl w:val="1"/>
+          <w:numId w:val="79"/>
+        </w:numPr>
+        <w:rPr>
+          <w:lang w:val="en-IN"/>
+        </w:rPr>
+      </w:pPr>
+      <w:proofErr w:type="spellStart"/>
+      <w:r>
+        <w:rPr>
+          <w:lang w:val="en-IN"/>
+        </w:rPr>
+        <w:t>type_mapper</w:t>
+      </w:r>
+      <w:proofErr w:type="spellEnd"/>
+    </w:p>
+    <w:p>
+      <w:pPr>
+        <w:numPr>
+          <w:ilvl w:val="1"/>
+          <w:numId w:val="79"/>
+        </w:numPr>
+        <w:rPr>
+          <w:lang w:val="en-IN"/>
+        </w:rPr>
+      </w:pPr>
+      <w:proofErr w:type="spellStart"/>
+      <w:r>
+        <w:rPr>
+          <w:lang w:val="en-IN"/>
+        </w:rPr>
+        <w:t>schema_generator</w:t>
+      </w:r>
+      <w:proofErr w:type="spellEnd"/>
+    </w:p>
+    <w:p>
+      <w:pPr>
+        <w:numPr>
+          <w:ilvl w:val="0"/>
+          <w:numId w:val="79"/>
+        </w:numPr>
+        <w:rPr>
+          <w:lang w:val="en-IN"/>
+        </w:rPr>
+      </w:pPr>
+      <w:r>
+        <w:rPr>
+          <w:lang w:val="en-IN"/>
+        </w:rPr>
+        <w:t>Ensure pipeline:</w:t>
+      </w:r>
+    </w:p>
+    <w:p>
+      <w:pPr>
+        <w:rPr>
+          <w:lang w:val="en-IN"/>
+        </w:rPr>
+      </w:pPr>
+      <w:r>
+        <w:rPr>
+          <w:lang w:val="en-IN"/>
+        </w:rPr>
+        <w:t>XMI → JSON → Type Mapping → SQL File</w:t>
+      </w:r>
+    </w:p>
+    <w:p>
+      <w:pPr>
+        <w:numPr>
+          <w:ilvl w:val="0"/>
+          <w:numId w:val="80"/>
+        </w:numPr>
+        <w:rPr>
+          <w:lang w:val="en-IN"/>
+        </w:rPr>
+      </w:pPr>
+      <w:r>
+        <w:rPr>
+          <w:lang w:val="en-IN"/>
+        </w:rPr>
+        <w:t>Define output structure:</w:t>
+      </w:r>
+    </w:p>
+    <w:p>
+      <w:pPr>
+        <w:numPr>
+          <w:ilvl w:val="1"/>
+          <w:numId w:val="80"/>
+        </w:numPr>
+        <w:rPr>
+          <w:lang w:val="en-IN"/>
+        </w:rPr>
+      </w:pPr>
+      <w:r>
+        <w:rPr>
+          <w:lang w:val="en-IN"/>
+        </w:rPr>
+        <w:t xml:space="preserve">Where </w:t>
+      </w:r>
+      <w:proofErr w:type="spellStart"/>
+      <w:r>
+        <w:rPr>
+          <w:lang w:val="en-IN"/>
+        </w:rPr>
+        <w:t>schema.sql</w:t>
+      </w:r>
+      <w:proofErr w:type="spellEnd"/>
+      <w:r>
+        <w:rPr>
+          <w:lang w:val="en-IN"/>
+        </w:rPr>
+        <w:t xml:space="preserve"> is saved</w:t>
+      </w:r>
+    </w:p>
+    <w:p>
+      <w:pPr>
+        <w:numPr>
+          <w:ilvl w:val="1"/>
+          <w:numId w:val="80"/>
+        </w:numPr>
+        <w:rPr>
+          <w:lang w:val="en-IN"/>
+        </w:rPr>
+      </w:pPr>
+      <w:r>
+        <w:rPr>
+          <w:lang w:val="en-IN"/>
+        </w:rPr>
+        <w:t xml:space="preserve">Overwrite </w:t>
+      </w:r>
+      <w:proofErr w:type="spellStart"/>
+      <w:r>
+        <w:rPr>
+          <w:lang w:val="en-IN"/>
+        </w:rPr>
+        <w:t>behavior</w:t>
+      </w:r>
+      <w:proofErr w:type="spellEnd"/>
+    </w:p>
+    <w:p>
+      <w:pPr>
+        <w:numPr>
+          <w:ilvl w:val="0"/>
+          <w:numId w:val="80"/>
+        </w:numPr>
+        <w:rPr>
+          <w:lang w:val="en-IN"/>
+        </w:rPr>
+      </w:pPr>
+      <w:r>
+        <w:rPr>
+          <w:lang w:val="en-IN"/>
+        </w:rPr>
+        <w:t>Run:</w:t>
+      </w:r>
+    </w:p>
+    <w:p>
+      <w:pPr>
+        <w:numPr>
+          <w:ilvl w:val="1"/>
+          <w:numId w:val="80"/>
+        </w:numPr>
+        <w:rPr>
+          <w:lang w:val="en-IN"/>
+        </w:rPr>
+      </w:pPr>
+      <w:r>
+        <w:rPr>
+          <w:lang w:val="en-IN"/>
+        </w:rPr>
+        <w:t>End-to-end tests</w:t>
+      </w:r>
+    </w:p>
+    <w:p>
+      <w:pPr>
+        <w:numPr>
+          <w:ilvl w:val="1"/>
+          <w:numId w:val="80"/>
+        </w:numPr>
+        <w:rPr>
+          <w:lang w:val="en-IN"/>
+        </w:rPr>
+      </w:pPr>
+      <w:r>
+        <w:rPr>
+          <w:lang w:val="en-IN"/>
+        </w:rPr>
+        <w:t>Performance check (20 classes case)</w:t>
+      </w:r>
+    </w:p>
+    <w:p>
+      <w:pPr>
+        <w:numPr>
+          <w:ilvl w:val="0"/>
+          <w:numId w:val="80"/>
+        </w:numPr>
+        <w:rPr>
+          <w:lang w:val="en-IN"/>
+        </w:rPr>
+      </w:pPr>
+      <w:r>
+        <w:rPr>
+          <w:lang w:val="en-IN"/>
+        </w:rPr>
+        <w:t>Freeze stable version of Spiral 2.</w:t>
+      </w:r>
+    </w:p>
+    <w:p>
+      <w:pPr>
+        <w:rPr>
+          <w:lang w:val="en-IN"/>
+        </w:rPr>
+      </w:pPr>
+      <w:r>
+        <w:rPr>
+          <w:lang w:val="en-IN"/>
+        </w:rPr>
+        <w:pict w14:anchorId="54493201">
+          <v:rect id="_x0000_i1180" style="width:0;height:1.5pt" o:hralign="center" o:hrstd="t" o:hr="t" fillcolor="#a0a0a0" stroked="f"/>
+        </w:pict>
+      </w:r>
+    </w:p>
+    <w:p>
+      <w:pPr>
+        <w:rPr>
+          <w:b/>
+          <w:bCs/>
+          <w:lang w:val="en-IN"/>
+        </w:rPr>
+      </w:pPr>
+      <w:r>
+        <w:rPr>
+          <w:rFonts w:ascii="Segoe UI Emoji" w:hAnsi="Segoe UI Emoji" w:cs="Segoe UI Emoji"/>
+          <w:b/>
+          <w:bCs/>
+          <w:lang w:val="en-IN"/>
+        </w:rPr>
+        <w:t>🧠</w:t>
+      </w:r>
+      <w:r>
+        <w:rPr>
+          <w:b/>
+          <w:bCs/>
+          <w:lang w:val="en-IN"/>
+        </w:rPr>
+        <w:t xml:space="preserve"> Why This Division Is Smart</w:t>
+      </w:r>
+    </w:p>
+    <w:p>
+      <w:pPr>
+        <w:numPr>
+          <w:ilvl w:val="0"/>
+          <w:numId w:val="81"/>
+        </w:numPr>
+        <w:rPr>
+          <w:lang w:val="en-IN"/>
+        </w:rPr>
+      </w:pPr>
+      <w:r>
+        <w:rPr>
+          <w:lang w:val="en-IN"/>
+        </w:rPr>
+        <w:t>Member 1 handles logic abstraction.</w:t>
+      </w:r>
+    </w:p>
+    <w:p>
+      <w:pPr>
+        <w:numPr>
+          <w:ilvl w:val="0"/>
+          <w:numId w:val="81"/>
+        </w:numPr>
+        <w:rPr>
+          <w:lang w:val="en-IN"/>
+        </w:rPr>
+      </w:pPr>
+      <w:r>
+        <w:rPr>
+          <w:lang w:val="en-IN"/>
+        </w:rPr>
+        <w:t>Member 2 handles SQL generation.</w:t>
+      </w:r>
+    </w:p>
+    <w:p>
+      <w:pPr>
+        <w:numPr>
+          <w:ilvl w:val="0"/>
+          <w:numId w:val="81"/>
+        </w:numPr>
+        <w:rPr>
+          <w:lang w:val="en-IN"/>
+        </w:rPr>
+      </w:pPr>
+      <w:r>
+        <w:rPr>
+          <w:lang w:val="en-IN"/>
+        </w:rPr>
+        <w:t>Member 3 ensures correctness &amp; robustness.</w:t>
+      </w:r>
+    </w:p>
+    <w:p>
+      <w:pPr>
+        <w:numPr>
+          <w:ilvl w:val="0"/>
+          <w:numId w:val="81"/>
+        </w:numPr>
+        <w:rPr>
+          <w:lang w:val="en-IN"/>
+        </w:rPr>
+      </w:pPr>
+      <w:r>
+        <w:rPr>
+          <w:lang w:val="en-IN"/>
+        </w:rPr>
+        <w:t>You control system flow and stability.</w:t>
+      </w:r>
+    </w:p>
+    <w:p>
+      <w:pPr>
+        <w:rPr>
+          <w:lang w:val="en-IN"/>
+        </w:rPr>
+      </w:pPr>
+      <w:r>
+        <w:rPr>
+          <w:lang w:val="en-IN"/>
+        </w:rPr>
+        <w:t>Nobody overlaps heavily.</w:t>
+      </w:r>
+      <w:r>
+        <w:rPr>
+          <w:lang w:val="en-IN"/>
+        </w:rPr>
+        <w:br/>
+        <w:t>Nobody is idle.</w:t>
+      </w:r>
+      <w:r>
+        <w:rPr>
+          <w:lang w:val="en-IN"/>
+        </w:rPr>
+        <w:br/>
+        <w:t>You maintain architectural overview.</w:t>
+      </w:r>
+    </w:p>
+    <w:p>
+      <w:pPr>
+        <w:rPr>
+          <w:lang w:val="en-IN"/>
+        </w:rPr>
+      </w:pPr>
+      <w:r>
+        <w:rPr>
+          <w:lang w:val="en-IN"/>
+        </w:rPr>
+        <w:pict w14:anchorId="17103E5C">
+          <v:rect id="_x0000_i1181" style="width:0;height:1.5pt" o:hralign="center" o:hrstd="t" o:hr="t" fillcolor="#a0a0a0" stroked="f"/>
+        </w:pict>
+      </w:r>
+    </w:p>
+    <w:p>
+      <w:pPr>
+        <w:rPr>
+          <w:b/>
+          <w:bCs/>
+          <w:lang w:val="en-IN"/>
+        </w:rPr>
+      </w:pPr>
+      <w:r>
+        <w:rPr>
+          <w:rFonts w:ascii="Segoe UI Symbol" w:hAnsi="Segoe UI Symbol" w:cs="Segoe UI Symbol"/>
+          <w:b/>
+          <w:bCs/>
+          <w:lang w:val="en-IN"/>
+        </w:rPr>
+        <w:t>⚠</w:t>
+      </w:r>
+      <w:r>
+        <w:rPr>
+          <w:b/>
+          <w:bCs/>
+          <w:lang w:val="en-IN"/>
+        </w:rPr>
+        <w:t xml:space="preserve"> What Should NOT Do </w:t>
+      </w:r>
+      <w:proofErr w:type="gramStart"/>
+      <w:r>
+        <w:rPr>
+          <w:b/>
+          <w:bCs/>
+          <w:lang w:val="en-IN"/>
+        </w:rPr>
+        <w:t>In</w:t>
+      </w:r>
+      <w:proofErr w:type="gramEnd"/>
+      <w:r>
+        <w:rPr>
+          <w:b/>
+          <w:bCs/>
+          <w:lang w:val="en-IN"/>
+        </w:rPr>
+        <w:t xml:space="preserve"> Spiral 2</w:t>
+      </w:r>
+    </w:p>
+    <w:p>
+      <w:pPr>
+        <w:rPr>
+          <w:lang w:val="en-IN"/>
+        </w:rPr>
+      </w:pPr>
+      <w:r>
+        <w:rPr>
+          <w:rFonts w:ascii="Segoe UI Emoji" w:hAnsi="Segoe UI Emoji" w:cs="Segoe UI Emoji"/>
+          <w:lang w:val="en-IN"/>
+        </w:rPr>
+        <w:t>❌</w:t>
+      </w:r>
+      <w:r>
+        <w:rPr>
+          <w:lang w:val="en-IN"/>
+        </w:rPr>
+        <w:t xml:space="preserve"> Do not implement foreign keys (push to Spiral 3)</w:t>
+      </w:r>
+      <w:r>
+        <w:rPr>
+          <w:lang w:val="en-IN"/>
+        </w:rPr>
+        <w:br/>
+      </w:r>
+      <w:r>
+        <w:rPr>
+          <w:rFonts w:ascii="Segoe UI Emoji" w:hAnsi="Segoe UI Emoji" w:cs="Segoe UI Emoji"/>
+          <w:lang w:val="en-IN"/>
+        </w:rPr>
+        <w:t>❌</w:t>
+      </w:r>
+      <w:r>
+        <w:rPr>
+          <w:lang w:val="en-IN"/>
+        </w:rPr>
+        <w:t xml:space="preserve"> Do not implement Flask</w:t>
+      </w:r>
+      <w:r>
+        <w:rPr>
+          <w:lang w:val="en-IN"/>
+        </w:rPr>
+        <w:br/>
+      </w:r>
+      <w:r>
+        <w:rPr>
+          <w:rFonts w:ascii="Segoe UI Emoji" w:hAnsi="Segoe UI Emoji" w:cs="Segoe UI Emoji"/>
+          <w:lang w:val="en-IN"/>
+        </w:rPr>
+        <w:t>❌</w:t>
+      </w:r>
+      <w:r>
+        <w:rPr>
+          <w:lang w:val="en-IN"/>
+        </w:rPr>
+        <w:t xml:space="preserve"> Do not optimize prematurely</w:t>
+      </w:r>
+      <w:r>
+        <w:rPr>
+          <w:lang w:val="en-IN"/>
+        </w:rPr>
+        <w:br/>
+      </w:r>
+      <w:r>
+        <w:rPr>
+          <w:rFonts w:ascii="Segoe UI Emoji" w:hAnsi="Segoe UI Emoji" w:cs="Segoe UI Emoji"/>
+          <w:lang w:val="en-IN"/>
+        </w:rPr>
+        <w:t>❌</w:t>
+      </w:r>
+      <w:r>
+        <w:rPr>
+          <w:lang w:val="en-IN"/>
+        </w:rPr>
+        <w:t xml:space="preserve"> Do not change internal JSON structure drastically</w:t>
+      </w:r>
+    </w:p>
+    <w:p>
+      <w:pPr>
+        <w:rPr>
+          <w:lang w:val="en-IN"/>
+        </w:rPr>
+      </w:pPr>
+      <w:r>
+        <w:rPr>
+          <w:lang w:val="en-IN"/>
+        </w:rPr>
+        <w:lastRenderedPageBreak/>
+        <w:t>Spiral 2 is about:</w:t>
+      </w:r>
+    </w:p>
+    <w:p>
+      <w:pPr>
+        <w:rPr>
+          <w:lang w:val="en-IN"/>
+        </w:rPr>
+      </w:pPr>
+      <w:r>
+        <w:rPr>
+          <w:lang w:val="en-IN"/>
+        </w:rPr>
+        <w:t>Reliable Table Generation Only.</w:t>
+      </w:r>
+    </w:p>
+    <w:p>
+      <w:pPr>
+        <w:rPr>
+          <w:lang w:val="en-IN"/>
+        </w:rPr>
+      </w:pPr>
+      <w:r>
+        <w:rPr>
+          <w:lang w:val="en-IN"/>
+        </w:rPr>
+        <w:pict w14:anchorId="65351BC6">
+          <v:rect id="_x0000_i1182" style="width:0;height:1.5pt" o:hralign="center" o:hrstd="t" o:hr="t" fillcolor="#a0a0a0" stroked="f"/>
+        </w:pict>
+      </w:r>
+    </w:p>
+    <w:p>
+      <w:pPr>
+        <w:rPr>
+          <w:b/>
+          <w:bCs/>
+          <w:lang w:val="en-IN"/>
+        </w:rPr>
+      </w:pPr>
+      <w:r>
+        <w:rPr>
+          <w:rFonts w:ascii="Segoe UI Symbol" w:hAnsi="Segoe UI Symbol" w:cs="Segoe UI Symbol"/>
+          <w:b/>
+          <w:bCs/>
+          <w:lang w:val="en-IN"/>
+        </w:rPr>
+        <w:t>⏱</w:t>
+      </w:r>
+      <w:r>
+        <w:rPr>
+          <w:b/>
+          <w:bCs/>
+          <w:lang w:val="en-IN"/>
+        </w:rPr>
+        <w:t xml:space="preserve"> Suggested Timeline (7–8 Days)</w:t>
+      </w:r>
+    </w:p>
+    <w:p>
+      <w:pPr>
+        <w:rPr>
+          <w:lang w:val="en-IN"/>
+        </w:rPr>
+      </w:pPr>
+      <w:r>
+        <w:rPr>
+          <w:lang w:val="en-IN"/>
+        </w:rPr>
+        <w:t>Day 1–2 → Type mapping design</w:t>
+      </w:r>
+      <w:r>
+        <w:rPr>
+          <w:lang w:val="en-IN"/>
+        </w:rPr>
+        <w:br/>
+        <w:t>Day 3–4 → Table generation</w:t>
+      </w:r>
+      <w:r>
+        <w:rPr>
+          <w:lang w:val="en-IN"/>
+        </w:rPr>
+        <w:br/>
+        <w:t>Day 5–6 → SQL validation &amp; MySQL testing</w:t>
+      </w:r>
+      <w:r>
+        <w:rPr>
+          <w:lang w:val="en-IN"/>
+        </w:rPr>
+        <w:br/>
+        <w:t>Day 7–8 → Integration + end-to-end testing</w:t>
+      </w:r>
+    </w:p>
+    <w:p>
+      <w:pPr>
+        <w:rPr>
+          <w:lang w:val="en-IN"/>
+        </w:rPr>
+      </w:pPr>
+      <w:r>
+        <w:rPr>
+          <w:lang w:val="en-IN"/>
+        </w:rPr>
+        <w:t>Then freeze.</w:t>
+      </w:r>
+    </w:p>
+    <w:p>
+      <w:pPr>
+        <w:rPr>
+          <w:lang w:val="en-IN"/>
+        </w:rPr>
+      </w:pPr>
+      <w:r>
+        <w:rPr>
+          <w:lang w:val="en-IN"/>
+        </w:rPr>
+        <w:pict w14:anchorId="4177584A">
+          <v:rect id="_x0000_i1183" style="width:0;height:1.5pt" o:hralign="center" o:hrstd="t" o:hr="t" fillcolor="#a0a0a0" stroked="f"/>
+        </w:pict>
+      </w:r>
+    </w:p>
+    <w:p>
+      <w:pPr>
+        <w:rPr>
+          <w:b/>
+          <w:bCs/>
+          <w:lang w:val="en-IN"/>
+        </w:rPr>
+      </w:pPr>
+      <w:r>
+        <w:rPr>
+          <w:rFonts w:ascii="Segoe UI Emoji" w:hAnsi="Segoe UI Emoji" w:cs="Segoe UI Emoji"/>
+          <w:b/>
+          <w:bCs/>
+          <w:lang w:val="en-IN"/>
+        </w:rPr>
+        <w:t>🏁</w:t>
+      </w:r>
+      <w:r>
+        <w:rPr>
+          <w:b/>
+          <w:bCs/>
+          <w:lang w:val="en-IN"/>
+        </w:rPr>
+        <w:t xml:space="preserve"> End of Spiral 2 You Should Have</w:t>
+      </w:r>
+    </w:p>
+    <w:p>
+      <w:pPr>
+        <w:rPr>
+          <w:lang w:val="en-IN"/>
+        </w:rPr>
+      </w:pPr>
+      <w:r>
+        <w:rPr>
+          <w:rFonts w:ascii="Segoe UI Symbol" w:hAnsi="Segoe UI Symbol" w:cs="Segoe UI Symbol"/>
+          <w:lang w:val="en-IN"/>
+        </w:rPr>
+        <w:t>✔</w:t>
+      </w:r>
+      <w:r>
+        <w:rPr>
+          <w:lang w:val="en-IN"/>
+        </w:rPr>
+        <w:t xml:space="preserve"> Valid </w:t>
+      </w:r>
+      <w:proofErr w:type="spellStart"/>
+      <w:r>
+        <w:rPr>
+          <w:lang w:val="en-IN"/>
+        </w:rPr>
+        <w:t>schema.sql</w:t>
+      </w:r>
+      <w:proofErr w:type="spellEnd"/>
+      <w:r>
+        <w:rPr>
+          <w:lang w:val="en-IN"/>
+        </w:rPr>
+        <w:br/>
+      </w:r>
+      <w:r>
+        <w:rPr>
+          <w:rFonts w:ascii="Segoe UI Symbol" w:hAnsi="Segoe UI Symbol" w:cs="Segoe UI Symbol"/>
+          <w:lang w:val="en-IN"/>
+        </w:rPr>
+        <w:t>✔</w:t>
+      </w:r>
+      <w:r>
+        <w:rPr>
+          <w:lang w:val="en-IN"/>
+        </w:rPr>
+        <w:t xml:space="preserve"> Deterministic output</w:t>
+      </w:r>
+      <w:r>
+        <w:rPr>
+          <w:lang w:val="en-IN"/>
+        </w:rPr>
+        <w:br/>
+      </w:r>
+      <w:r>
+        <w:rPr>
+          <w:rFonts w:ascii="Segoe UI Symbol" w:hAnsi="Segoe UI Symbol" w:cs="Segoe UI Symbol"/>
+          <w:lang w:val="en-IN"/>
+        </w:rPr>
+        <w:t>✔</w:t>
+      </w:r>
+      <w:r>
+        <w:rPr>
+          <w:lang w:val="en-IN"/>
+        </w:rPr>
+        <w:t xml:space="preserve"> Clean architecture separation</w:t>
+      </w:r>
+      <w:r>
+        <w:rPr>
+          <w:lang w:val="en-IN"/>
+        </w:rPr>
+        <w:br/>
+      </w:r>
+      <w:r>
+        <w:rPr>
+          <w:rFonts w:ascii="Segoe UI Symbol" w:hAnsi="Segoe UI Symbol" w:cs="Segoe UI Symbol"/>
+          <w:lang w:val="en-IN"/>
+        </w:rPr>
+        <w:t>✔</w:t>
+      </w:r>
+      <w:r>
+        <w:rPr>
+          <w:lang w:val="en-IN"/>
+        </w:rPr>
+        <w:t xml:space="preserve"> Fully tested table creation</w:t>
+      </w:r>
+      <w:r>
+        <w:rPr>
+          <w:lang w:val="en-IN"/>
+        </w:rPr>
+        <w:br/>
+      </w:r>
+      <w:r>
+        <w:rPr>
+          <w:rFonts w:ascii="Segoe UI Symbol" w:hAnsi="Segoe UI Symbol" w:cs="Segoe UI Symbol"/>
+          <w:lang w:val="en-IN"/>
+        </w:rPr>
+        <w:t>✔</w:t>
+      </w:r>
+      <w:r>
+        <w:rPr>
+          <w:lang w:val="en-IN"/>
+        </w:rPr>
+        <w:t xml:space="preserve"> Zero SQL syntax errors</w:t>
+      </w:r>
+    </w:p>
+    <w:p>
+      <w:pPr>
+        <w:rPr>
+          <w:lang w:val="en-IN"/>
+        </w:rPr>
+      </w:pPr>
+      <w:r>
+        <w:rPr>
+          <w:lang w:val="en-IN"/>
+        </w:rPr>
+        <w:t>Now system becomes real.</w:t>
+      </w:r>
+    </w:p>
+    <w:p/>
     <w:sectPr>
-      <w:headerReference w:type="default" r:id="rId11"/>
-      <w:footerReference w:type="default" r:id="rId12"/>
-      <w:headerReference w:type="first" r:id="rId13"/>
-      <w:footerReference w:type="first" r:id="rId14"/>
+      <w:headerReference w:type="default" r:id="rId12"/>
+      <w:footerReference w:type="default" r:id="rId13"/>
+      <w:headerReference w:type="first" r:id="rId14"/>
+      <w:footerReference w:type="first" r:id="rId15"/>
       <w:pgSz w:w="12240" w:h="15840" w:code="1"/>
       <w:pgMar w:top="720" w:right="1080" w:bottom="720" w:left="1080" w:header="648" w:footer="432" w:gutter="0"/>
       <w:cols w:space="708"/>
@@ -3544,10 +5820,9 @@
         <w:placeholder>
           <w:docPart w:val="016C74269F424344B967DBB818E662D7"/>
         </w:placeholder>
-        <w:showingPlcHdr/>
         <w:dataBinding w:prefixMappings="xmlns:ns0='http://schemas.microsoft.com/office/2006/coverPageProps' " w:xpath="/ns0:CoverPageProperties[1]/ns0:PublishDate[1]" w:storeItemID="{55AF091B-3C7A-41E3-B477-F2FDAA23CFDA}"/>
         <w15:appearance w15:val="hidden"/>
-        <w:date w:fullDate="2026-02-14T00:00:00Z">
+        <w:date>
           <w:dateFormat w:val="MMMM d, yyyy"/>
           <w:lid w:val="en-US"/>
           <w:storeMappedDataAs w:val="dateTime"/>
@@ -3556,7 +5831,7 @@
       </w:sdtPr>
       <w:sdtContent>
         <w:r>
-          <w:t>HOME-BASED AGENCY</w:t>
+          <w:t>Software Engineering Project</w:t>
         </w:r>
       </w:sdtContent>
     </w:sdt>
@@ -3596,7 +5871,6 @@
         <w:placeholder>
           <w:docPart w:val="2347E8F1E82C429F97453EFCD385ADD5"/>
         </w:placeholder>
-        <w:showingPlcHdr/>
         <w:dataBinding w:prefixMappings="xmlns:ns0='http://schemas.microsoft.com/office/2006/coverPageProps' " w:xpath="/ns0:CoverPageProperties[1]/ns0:PublishDate[1]" w:storeItemID="{55AF091B-3C7A-41E3-B477-F2FDAA23CFDA}"/>
         <w15:appearance w15:val="hidden"/>
         <w:date>
@@ -3608,11 +5882,7 @@
       </w:sdtPr>
       <w:sdtContent>
         <w:r>
-          <w:rPr>
-            <w:rStyle w:val="PlaceholderText"/>
-            <w:color w:val="595959" w:themeColor="text1" w:themeTint="A6"/>
-          </w:rPr>
-          <w:t>Report Date</w:t>
+          <w:t>Software Engineering Project</w:t>
         </w:r>
       </w:sdtContent>
     </w:sdt>
@@ -3913,6 +6183,11 @@
 
 <file path=word/numbering.xml><?xml version="1.0" encoding="utf-8"?>
 <w:numbering xmlns:wpc="http://schemas.microsoft.com/office/word/2010/wordprocessingCanvas" xmlns:cx="http://schemas.microsoft.com/office/drawing/2014/chartex" xmlns:cx1="http://schemas.microsoft.com/office/drawing/2015/9/8/chartex" xmlns:cx2="http://schemas.microsoft.com/office/drawing/2015/10/21/chartex" xmlns:cx3="http://schemas.microsoft.com/office/drawing/2016/5/9/chartex" xmlns:cx4="http://schemas.microsoft.com/office/drawing/2016/5/10/chartex" xmlns:cx5="http://schemas.microsoft.com/office/drawing/2016/5/11/chartex" xmlns:cx6="http://schemas.microsoft.com/office/drawing/2016/5/12/chartex" xmlns:cx7="http://schemas.microsoft.com/office/drawing/2016/5/13/chartex" xmlns:cx8="http://schemas.microsoft.com/office/drawing/2016/5/14/chartex" xmlns:mc="http://schemas.openxmlformats.org/markup-compatibility/2006" xmlns:aink="http://schemas.microsoft.com/office/drawing/2016/ink" xmlns:am3d="http://schemas.microsoft.com/office/drawing/2017/model3d" xmlns:o="urn:schemas-microsoft-com:office:office" xmlns:oel="http://schemas.microsoft.com/office/2019/extlst" xmlns:r="http://schemas.openxmlformats.org/officeDocument/2006/relationships" xmlns:m="http://schemas.openxmlformats.org/officeDocument/2006/math" xmlns:v="urn:schemas-microsoft-com:vml" xmlns:wp14="http://schemas.microsoft.com/office/word/2010/wordprocessingDrawing" xmlns:wp="http://schemas.openxmlformats.org/drawingml/2006/wordprocessingDrawing" xmlns:w10="urn:schemas-microsoft-com:office:word" xmlns:w="http://schemas.openxmlformats.org/wordprocessingml/2006/main" xmlns:w14="http://schemas.microsoft.com/office/word/2010/wordml" xmlns:w15="http://schemas.microsoft.com/office/word/2012/wordml" xmlns:w16cex="http://schemas.microsoft.com/office/word/2018/wordml/cex" xmlns:w16cid="http://schemas.microsoft.com/office/word/2016/wordml/cid" xmlns:w16="http://schemas.microsoft.com/office/word/2018/wordml" xmlns:w16du="http://schemas.microsoft.com/office/word/2023/wordml/word16du" xmlns:w16sdtdh="http://schemas.microsoft.com/office/word/2020/wordml/sdtdatahash" xmlns:w16sdtfl="http://schemas.microsoft.com/office/word/2024/wordml/sdtformatlock" xmlns:w16se="http://schemas.microsoft.com/office/word/2015/wordml/symex" xmlns:wpg="http://schemas.microsoft.com/office/word/2010/wordprocessingGroup" xmlns:wpi="http://schemas.microsoft.com/office/word/2010/wordprocessingInk" xmlns:wne="http://schemas.microsoft.com/office/word/2006/wordml" xmlns:wps="http://schemas.microsoft.com/office/word/2010/wordprocessingShape" mc:Ignorable="w14 w15 w16se w16cid w16 w16cex w16sdtdh w16sdtfl w16du wp14">
+  <w:numPicBullet w:numPicBulletId="0">
+    <w:pict>
+      <v:rect id="_x0000_i1025" style="width:0;height:1.5pt" o:hralign="center" o:bullet="t" o:hrstd="t" o:hr="t" fillcolor="#a0a0a0" stroked="f"/>
+    </w:pict>
+  </w:numPicBullet>
   <w:abstractNum w:abstractNumId="0" w15:restartNumberingAfterBreak="0">
     <w:nsid w:val="FFFFFF7F"/>
     <w:multiLevelType w:val="singleLevel"/>
@@ -6367,6 +8642,155 @@
     </w:lvl>
   </w:abstractNum>
   <w:abstractNum w:abstractNumId="24" w15:restartNumberingAfterBreak="0">
+    <w:nsid w:val="1AD637AD"/>
+    <w:multiLevelType w:val="multilevel"/>
+    <w:tmpl w:val="5F7EE7F6"/>
+    <w:lvl w:ilvl="0">
+      <w:start w:val="1"/>
+      <w:numFmt w:val="bullet"/>
+      <w:lvlText w:val=""/>
+      <w:lvlJc w:val="left"/>
+      <w:pPr>
+        <w:tabs>
+          <w:tab w:val="num" w:pos="720"/>
+        </w:tabs>
+        <w:ind w:left="720" w:hanging="360"/>
+      </w:pPr>
+      <w:rPr>
+        <w:rFonts w:ascii="Symbol" w:hAnsi="Symbol" w:hint="default"/>
+        <w:sz w:val="20"/>
+      </w:rPr>
+    </w:lvl>
+    <w:lvl w:ilvl="1" w:tentative="1">
+      <w:start w:val="1"/>
+      <w:numFmt w:val="bullet"/>
+      <w:lvlText w:val="o"/>
+      <w:lvlJc w:val="left"/>
+      <w:pPr>
+        <w:tabs>
+          <w:tab w:val="num" w:pos="1440"/>
+        </w:tabs>
+        <w:ind w:left="1440" w:hanging="360"/>
+      </w:pPr>
+      <w:rPr>
+        <w:rFonts w:ascii="Courier New" w:hAnsi="Courier New" w:hint="default"/>
+        <w:sz w:val="20"/>
+      </w:rPr>
+    </w:lvl>
+    <w:lvl w:ilvl="2" w:tentative="1">
+      <w:start w:val="1"/>
+      <w:numFmt w:val="bullet"/>
+      <w:lvlText w:val=""/>
+      <w:lvlJc w:val="left"/>
+      <w:pPr>
+        <w:tabs>
+          <w:tab w:val="num" w:pos="2160"/>
+        </w:tabs>
+        <w:ind w:left="2160" w:hanging="360"/>
+      </w:pPr>
+      <w:rPr>
+        <w:rFonts w:ascii="Wingdings" w:hAnsi="Wingdings" w:hint="default"/>
+        <w:sz w:val="20"/>
+      </w:rPr>
+    </w:lvl>
+    <w:lvl w:ilvl="3" w:tentative="1">
+      <w:start w:val="1"/>
+      <w:numFmt w:val="bullet"/>
+      <w:lvlText w:val=""/>
+      <w:lvlJc w:val="left"/>
+      <w:pPr>
+        <w:tabs>
+          <w:tab w:val="num" w:pos="2880"/>
+        </w:tabs>
+        <w:ind w:left="2880" w:hanging="360"/>
+      </w:pPr>
+      <w:rPr>
+        <w:rFonts w:ascii="Wingdings" w:hAnsi="Wingdings" w:hint="default"/>
+        <w:sz w:val="20"/>
+      </w:rPr>
+    </w:lvl>
+    <w:lvl w:ilvl="4" w:tentative="1">
+      <w:start w:val="1"/>
+      <w:numFmt w:val="bullet"/>
+      <w:lvlText w:val=""/>
+      <w:lvlJc w:val="left"/>
+      <w:pPr>
+        <w:tabs>
+          <w:tab w:val="num" w:pos="3600"/>
+        </w:tabs>
+        <w:ind w:left="3600" w:hanging="360"/>
+      </w:pPr>
+      <w:rPr>
+        <w:rFonts w:ascii="Wingdings" w:hAnsi="Wingdings" w:hint="default"/>
+        <w:sz w:val="20"/>
+      </w:rPr>
+    </w:lvl>
+    <w:lvl w:ilvl="5" w:tentative="1">
+      <w:start w:val="1"/>
+      <w:numFmt w:val="bullet"/>
+      <w:lvlText w:val=""/>
+      <w:lvlJc w:val="left"/>
+      <w:pPr>
+        <w:tabs>
+          <w:tab w:val="num" w:pos="4320"/>
+        </w:tabs>
+        <w:ind w:left="4320" w:hanging="360"/>
+      </w:pPr>
+      <w:rPr>
+        <w:rFonts w:ascii="Wingdings" w:hAnsi="Wingdings" w:hint="default"/>
+        <w:sz w:val="20"/>
+      </w:rPr>
+    </w:lvl>
+    <w:lvl w:ilvl="6" w:tentative="1">
+      <w:start w:val="1"/>
+      <w:numFmt w:val="bullet"/>
+      <w:lvlText w:val=""/>
+      <w:lvlJc w:val="left"/>
+      <w:pPr>
+        <w:tabs>
+          <w:tab w:val="num" w:pos="5040"/>
+        </w:tabs>
+        <w:ind w:left="5040" w:hanging="360"/>
+      </w:pPr>
+      <w:rPr>
+        <w:rFonts w:ascii="Wingdings" w:hAnsi="Wingdings" w:hint="default"/>
+        <w:sz w:val="20"/>
+      </w:rPr>
+    </w:lvl>
+    <w:lvl w:ilvl="7" w:tentative="1">
+      <w:start w:val="1"/>
+      <w:numFmt w:val="bullet"/>
+      <w:lvlText w:val=""/>
+      <w:lvlJc w:val="left"/>
+      <w:pPr>
+        <w:tabs>
+          <w:tab w:val="num" w:pos="5760"/>
+        </w:tabs>
+        <w:ind w:left="5760" w:hanging="360"/>
+      </w:pPr>
+      <w:rPr>
+        <w:rFonts w:ascii="Wingdings" w:hAnsi="Wingdings" w:hint="default"/>
+        <w:sz w:val="20"/>
+      </w:rPr>
+    </w:lvl>
+    <w:lvl w:ilvl="8" w:tentative="1">
+      <w:start w:val="1"/>
+      <w:numFmt w:val="bullet"/>
+      <w:lvlText w:val=""/>
+      <w:lvlJc w:val="left"/>
+      <w:pPr>
+        <w:tabs>
+          <w:tab w:val="num" w:pos="6480"/>
+        </w:tabs>
+        <w:ind w:left="6480" w:hanging="360"/>
+      </w:pPr>
+      <w:rPr>
+        <w:rFonts w:ascii="Wingdings" w:hAnsi="Wingdings" w:hint="default"/>
+        <w:sz w:val="20"/>
+      </w:rPr>
+    </w:lvl>
+  </w:abstractNum>
+  <w:abstractNum w:abstractNumId="25" w15:restartNumberingAfterBreak="0">
     <w:nsid w:val="1BC4754A"/>
     <w:multiLevelType w:val="multilevel"/>
     <w:tmpl w:val="D3F62CDA"/>
@@ -6515,7 +8939,7 @@
       </w:rPr>
     </w:lvl>
   </w:abstractNum>
-  <w:abstractNum w:abstractNumId="25" w15:restartNumberingAfterBreak="0">
+  <w:abstractNum w:abstractNumId="26" w15:restartNumberingAfterBreak="0">
     <w:nsid w:val="1EA90179"/>
     <w:multiLevelType w:val="multilevel"/>
     <w:tmpl w:val="70F84568"/>
@@ -6664,7 +9088,7 @@
       </w:rPr>
     </w:lvl>
   </w:abstractNum>
-  <w:abstractNum w:abstractNumId="26" w15:restartNumberingAfterBreak="0">
+  <w:abstractNum w:abstractNumId="27" w15:restartNumberingAfterBreak="0">
     <w:nsid w:val="1EDB6146"/>
     <w:multiLevelType w:val="hybridMultilevel"/>
     <w:tmpl w:val="1DF0CA9C"/>
@@ -6777,7 +9201,7 @@
       </w:rPr>
     </w:lvl>
   </w:abstractNum>
-  <w:abstractNum w:abstractNumId="27" w15:restartNumberingAfterBreak="0">
+  <w:abstractNum w:abstractNumId="28" w15:restartNumberingAfterBreak="0">
     <w:nsid w:val="20DB2FD9"/>
     <w:multiLevelType w:val="multilevel"/>
     <w:tmpl w:val="A668897E"/>
@@ -6926,7 +9350,7 @@
       </w:rPr>
     </w:lvl>
   </w:abstractNum>
-  <w:abstractNum w:abstractNumId="28" w15:restartNumberingAfterBreak="0">
+  <w:abstractNum w:abstractNumId="29" w15:restartNumberingAfterBreak="0">
     <w:nsid w:val="23FB1F5D"/>
     <w:multiLevelType w:val="multilevel"/>
     <w:tmpl w:val="B3EA8DB8"/>
@@ -7075,7 +9499,7 @@
       </w:rPr>
     </w:lvl>
   </w:abstractNum>
-  <w:abstractNum w:abstractNumId="29" w15:restartNumberingAfterBreak="0">
+  <w:abstractNum w:abstractNumId="30" w15:restartNumberingAfterBreak="0">
     <w:nsid w:val="26862ED7"/>
     <w:multiLevelType w:val="multilevel"/>
     <w:tmpl w:val="58C272D0"/>
@@ -7224,7 +9648,7 @@
       </w:rPr>
     </w:lvl>
   </w:abstractNum>
-  <w:abstractNum w:abstractNumId="30" w15:restartNumberingAfterBreak="0">
+  <w:abstractNum w:abstractNumId="31" w15:restartNumberingAfterBreak="0">
     <w:nsid w:val="27B872C6"/>
     <w:multiLevelType w:val="hybridMultilevel"/>
     <w:tmpl w:val="B2560376"/>
@@ -7314,7 +9738,7 @@
       </w:pPr>
     </w:lvl>
   </w:abstractNum>
-  <w:abstractNum w:abstractNumId="31" w15:restartNumberingAfterBreak="0">
+  <w:abstractNum w:abstractNumId="32" w15:restartNumberingAfterBreak="0">
     <w:nsid w:val="2D9448EF"/>
     <w:multiLevelType w:val="hybridMultilevel"/>
     <w:tmpl w:val="A92A2166"/>
@@ -7406,7 +9830,7 @@
       </w:pPr>
     </w:lvl>
   </w:abstractNum>
-  <w:abstractNum w:abstractNumId="32" w15:restartNumberingAfterBreak="0">
+  <w:abstractNum w:abstractNumId="33" w15:restartNumberingAfterBreak="0">
     <w:nsid w:val="2DE867BE"/>
     <w:multiLevelType w:val="hybridMultilevel"/>
     <w:tmpl w:val="80663AD0"/>
@@ -7519,7 +9943,7 @@
       </w:rPr>
     </w:lvl>
   </w:abstractNum>
-  <w:abstractNum w:abstractNumId="33" w15:restartNumberingAfterBreak="0">
+  <w:abstractNum w:abstractNumId="34" w15:restartNumberingAfterBreak="0">
     <w:nsid w:val="2E331351"/>
     <w:multiLevelType w:val="hybridMultilevel"/>
     <w:tmpl w:val="72966E82"/>
@@ -7611,7 +10035,7 @@
       </w:pPr>
     </w:lvl>
   </w:abstractNum>
-  <w:abstractNum w:abstractNumId="34" w15:restartNumberingAfterBreak="0">
+  <w:abstractNum w:abstractNumId="35" w15:restartNumberingAfterBreak="0">
     <w:nsid w:val="2E7F706C"/>
     <w:multiLevelType w:val="multilevel"/>
     <w:tmpl w:val="3B2A2E16"/>
@@ -7760,7 +10184,7 @@
       </w:rPr>
     </w:lvl>
   </w:abstractNum>
-  <w:abstractNum w:abstractNumId="35" w15:restartNumberingAfterBreak="0">
+  <w:abstractNum w:abstractNumId="36" w15:restartNumberingAfterBreak="0">
     <w:nsid w:val="31CF1929"/>
     <w:multiLevelType w:val="hybridMultilevel"/>
     <w:tmpl w:val="BB044024"/>
@@ -7873,7 +10297,7 @@
       </w:rPr>
     </w:lvl>
   </w:abstractNum>
-  <w:abstractNum w:abstractNumId="36" w15:restartNumberingAfterBreak="0">
+  <w:abstractNum w:abstractNumId="37" w15:restartNumberingAfterBreak="0">
     <w:nsid w:val="321351B2"/>
     <w:multiLevelType w:val="hybridMultilevel"/>
     <w:tmpl w:val="C2A23606"/>
@@ -7986,7 +10410,7 @@
       </w:rPr>
     </w:lvl>
   </w:abstractNum>
-  <w:abstractNum w:abstractNumId="37" w15:restartNumberingAfterBreak="0">
+  <w:abstractNum w:abstractNumId="38" w15:restartNumberingAfterBreak="0">
     <w:nsid w:val="330B7AF6"/>
     <w:multiLevelType w:val="hybridMultilevel"/>
     <w:tmpl w:val="F46C5356"/>
@@ -8099,7 +10523,7 @@
       </w:rPr>
     </w:lvl>
   </w:abstractNum>
-  <w:abstractNum w:abstractNumId="38" w15:restartNumberingAfterBreak="0">
+  <w:abstractNum w:abstractNumId="39" w15:restartNumberingAfterBreak="0">
     <w:nsid w:val="3C443B65"/>
     <w:multiLevelType w:val="multilevel"/>
     <w:tmpl w:val="B3EA8F1C"/>
@@ -8248,7 +10672,7 @@
       </w:rPr>
     </w:lvl>
   </w:abstractNum>
-  <w:abstractNum w:abstractNumId="39" w15:restartNumberingAfterBreak="0">
+  <w:abstractNum w:abstractNumId="40" w15:restartNumberingAfterBreak="0">
     <w:nsid w:val="3D0C44DB"/>
     <w:multiLevelType w:val="multilevel"/>
     <w:tmpl w:val="942C07BC"/>
@@ -8397,7 +10821,7 @@
       </w:rPr>
     </w:lvl>
   </w:abstractNum>
-  <w:abstractNum w:abstractNumId="40" w15:restartNumberingAfterBreak="0">
+  <w:abstractNum w:abstractNumId="41" w15:restartNumberingAfterBreak="0">
     <w:nsid w:val="3E6C7223"/>
     <w:multiLevelType w:val="hybridMultilevel"/>
     <w:tmpl w:val="D6FABF52"/>
@@ -8483,7 +10907,7 @@
       </w:pPr>
     </w:lvl>
   </w:abstractNum>
-  <w:abstractNum w:abstractNumId="41" w15:restartNumberingAfterBreak="0">
+  <w:abstractNum w:abstractNumId="42" w15:restartNumberingAfterBreak="0">
     <w:nsid w:val="3F8F198D"/>
     <w:multiLevelType w:val="hybridMultilevel"/>
     <w:tmpl w:val="03680CDA"/>
@@ -8575,7 +10999,124 @@
       </w:pPr>
     </w:lvl>
   </w:abstractNum>
-  <w:abstractNum w:abstractNumId="42" w15:restartNumberingAfterBreak="0">
+  <w:abstractNum w:abstractNumId="43" w15:restartNumberingAfterBreak="0">
+    <w:nsid w:val="400E175A"/>
+    <w:multiLevelType w:val="multilevel"/>
+    <w:tmpl w:val="183AEBC8"/>
+    <w:lvl w:ilvl="0">
+      <w:start w:val="1"/>
+      <w:numFmt w:val="decimal"/>
+      <w:lvlText w:val="%1."/>
+      <w:lvlJc w:val="left"/>
+      <w:pPr>
+        <w:tabs>
+          <w:tab w:val="num" w:pos="720"/>
+        </w:tabs>
+        <w:ind w:left="720" w:hanging="360"/>
+      </w:pPr>
+    </w:lvl>
+    <w:lvl w:ilvl="1">
+      <w:start w:val="1"/>
+      <w:numFmt w:val="bullet"/>
+      <w:lvlText w:val="o"/>
+      <w:lvlJc w:val="left"/>
+      <w:pPr>
+        <w:tabs>
+          <w:tab w:val="num" w:pos="1440"/>
+        </w:tabs>
+        <w:ind w:left="1440" w:hanging="360"/>
+      </w:pPr>
+      <w:rPr>
+        <w:rFonts w:ascii="Courier New" w:hAnsi="Courier New" w:hint="default"/>
+        <w:sz w:val="20"/>
+      </w:rPr>
+    </w:lvl>
+    <w:lvl w:ilvl="2" w:tentative="1">
+      <w:start w:val="1"/>
+      <w:numFmt w:val="decimal"/>
+      <w:lvlText w:val="%3."/>
+      <w:lvlJc w:val="left"/>
+      <w:pPr>
+        <w:tabs>
+          <w:tab w:val="num" w:pos="2160"/>
+        </w:tabs>
+        <w:ind w:left="2160" w:hanging="360"/>
+      </w:pPr>
+    </w:lvl>
+    <w:lvl w:ilvl="3" w:tentative="1">
+      <w:start w:val="1"/>
+      <w:numFmt w:val="decimal"/>
+      <w:lvlText w:val="%4."/>
+      <w:lvlJc w:val="left"/>
+      <w:pPr>
+        <w:tabs>
+          <w:tab w:val="num" w:pos="2880"/>
+        </w:tabs>
+        <w:ind w:left="2880" w:hanging="360"/>
+      </w:pPr>
+    </w:lvl>
+    <w:lvl w:ilvl="4" w:tentative="1">
+      <w:start w:val="1"/>
+      <w:numFmt w:val="decimal"/>
+      <w:lvlText w:val="%5."/>
+      <w:lvlJc w:val="left"/>
+      <w:pPr>
+        <w:tabs>
+          <w:tab w:val="num" w:pos="3600"/>
+        </w:tabs>
+        <w:ind w:left="3600" w:hanging="360"/>
+      </w:pPr>
+    </w:lvl>
+    <w:lvl w:ilvl="5" w:tentative="1">
+      <w:start w:val="1"/>
+      <w:numFmt w:val="decimal"/>
+      <w:lvlText w:val="%6."/>
+      <w:lvlJc w:val="left"/>
+      <w:pPr>
+        <w:tabs>
+          <w:tab w:val="num" w:pos="4320"/>
+        </w:tabs>
+        <w:ind w:left="4320" w:hanging="360"/>
+      </w:pPr>
+    </w:lvl>
+    <w:lvl w:ilvl="6" w:tentative="1">
+      <w:start w:val="1"/>
+      <w:numFmt w:val="decimal"/>
+      <w:lvlText w:val="%7."/>
+      <w:lvlJc w:val="left"/>
+      <w:pPr>
+        <w:tabs>
+          <w:tab w:val="num" w:pos="5040"/>
+        </w:tabs>
+        <w:ind w:left="5040" w:hanging="360"/>
+      </w:pPr>
+    </w:lvl>
+    <w:lvl w:ilvl="7" w:tentative="1">
+      <w:start w:val="1"/>
+      <w:numFmt w:val="decimal"/>
+      <w:lvlText w:val="%8."/>
+      <w:lvlJc w:val="left"/>
+      <w:pPr>
+        <w:tabs>
+          <w:tab w:val="num" w:pos="5760"/>
+        </w:tabs>
+        <w:ind w:left="5760" w:hanging="360"/>
+      </w:pPr>
+    </w:lvl>
+    <w:lvl w:ilvl="8" w:tentative="1">
+      <w:start w:val="1"/>
+      <w:numFmt w:val="decimal"/>
+      <w:lvlText w:val="%9."/>
+      <w:lvlJc w:val="left"/>
+      <w:pPr>
+        <w:tabs>
+          <w:tab w:val="num" w:pos="6480"/>
+        </w:tabs>
+        <w:ind w:left="6480" w:hanging="360"/>
+      </w:pPr>
+    </w:lvl>
+  </w:abstractNum>
+  <w:abstractNum w:abstractNumId="44" w15:restartNumberingAfterBreak="0">
     <w:nsid w:val="47E30448"/>
     <w:multiLevelType w:val="multilevel"/>
     <w:tmpl w:val="FE14E482"/>
@@ -8688,7 +11229,7 @@
       </w:pPr>
     </w:lvl>
   </w:abstractNum>
-  <w:abstractNum w:abstractNumId="43" w15:restartNumberingAfterBreak="0">
+  <w:abstractNum w:abstractNumId="45" w15:restartNumberingAfterBreak="0">
     <w:nsid w:val="48B16EF7"/>
     <w:multiLevelType w:val="multilevel"/>
     <w:tmpl w:val="72FCCB62"/>
@@ -8837,7 +11378,7 @@
       </w:rPr>
     </w:lvl>
   </w:abstractNum>
-  <w:abstractNum w:abstractNumId="44" w15:restartNumberingAfterBreak="0">
+  <w:abstractNum w:abstractNumId="46" w15:restartNumberingAfterBreak="0">
     <w:nsid w:val="492013B8"/>
     <w:multiLevelType w:val="hybridMultilevel"/>
     <w:tmpl w:val="7BF042D8"/>
@@ -8950,7 +11491,7 @@
       </w:rPr>
     </w:lvl>
   </w:abstractNum>
-  <w:abstractNum w:abstractNumId="45" w15:restartNumberingAfterBreak="0">
+  <w:abstractNum w:abstractNumId="47" w15:restartNumberingAfterBreak="0">
     <w:nsid w:val="498E048A"/>
     <w:multiLevelType w:val="multilevel"/>
     <w:tmpl w:val="A6FE0EB4"/>
@@ -9099,7 +11640,7 @@
       </w:rPr>
     </w:lvl>
   </w:abstractNum>
-  <w:abstractNum w:abstractNumId="46" w15:restartNumberingAfterBreak="0">
+  <w:abstractNum w:abstractNumId="48" w15:restartNumberingAfterBreak="0">
     <w:nsid w:val="4F425193"/>
     <w:multiLevelType w:val="hybridMultilevel"/>
     <w:tmpl w:val="2B4662AC"/>
@@ -9191,7 +11732,7 @@
       </w:pPr>
     </w:lvl>
   </w:abstractNum>
-  <w:abstractNum w:abstractNumId="47" w15:restartNumberingAfterBreak="0">
+  <w:abstractNum w:abstractNumId="49" w15:restartNumberingAfterBreak="0">
     <w:nsid w:val="528C1828"/>
     <w:multiLevelType w:val="multilevel"/>
     <w:tmpl w:val="00E80A22"/>
@@ -9310,7 +11851,124 @@
       </w:rPr>
     </w:lvl>
   </w:abstractNum>
-  <w:abstractNum w:abstractNumId="48" w15:restartNumberingAfterBreak="0">
+  <w:abstractNum w:abstractNumId="50" w15:restartNumberingAfterBreak="0">
+    <w:nsid w:val="53DE4320"/>
+    <w:multiLevelType w:val="multilevel"/>
+    <w:tmpl w:val="ACD03A00"/>
+    <w:lvl w:ilvl="0">
+      <w:start w:val="1"/>
+      <w:numFmt w:val="decimal"/>
+      <w:lvlText w:val="%1."/>
+      <w:lvlJc w:val="left"/>
+      <w:pPr>
+        <w:tabs>
+          <w:tab w:val="num" w:pos="720"/>
+        </w:tabs>
+        <w:ind w:left="720" w:hanging="360"/>
+      </w:pPr>
+    </w:lvl>
+    <w:lvl w:ilvl="1">
+      <w:start w:val="1"/>
+      <w:numFmt w:val="bullet"/>
+      <w:lvlText w:val="o"/>
+      <w:lvlJc w:val="left"/>
+      <w:pPr>
+        <w:tabs>
+          <w:tab w:val="num" w:pos="1440"/>
+        </w:tabs>
+        <w:ind w:left="1440" w:hanging="360"/>
+      </w:pPr>
+      <w:rPr>
+        <w:rFonts w:ascii="Courier New" w:hAnsi="Courier New" w:hint="default"/>
+        <w:sz w:val="20"/>
+      </w:rPr>
+    </w:lvl>
+    <w:lvl w:ilvl="2" w:tentative="1">
+      <w:start w:val="1"/>
+      <w:numFmt w:val="decimal"/>
+      <w:lvlText w:val="%3."/>
+      <w:lvlJc w:val="left"/>
+      <w:pPr>
+        <w:tabs>
+          <w:tab w:val="num" w:pos="2160"/>
+        </w:tabs>
+        <w:ind w:left="2160" w:hanging="360"/>
+      </w:pPr>
+    </w:lvl>
+    <w:lvl w:ilvl="3" w:tentative="1">
+      <w:start w:val="1"/>
+      <w:numFmt w:val="decimal"/>
+      <w:lvlText w:val="%4."/>
+      <w:lvlJc w:val="left"/>
+      <w:pPr>
+        <w:tabs>
+          <w:tab w:val="num" w:pos="2880"/>
+        </w:tabs>
+        <w:ind w:left="2880" w:hanging="360"/>
+      </w:pPr>
+    </w:lvl>
+    <w:lvl w:ilvl="4" w:tentative="1">
+      <w:start w:val="1"/>
+      <w:numFmt w:val="decimal"/>
+      <w:lvlText w:val="%5."/>
+      <w:lvlJc w:val="left"/>
+      <w:pPr>
+        <w:tabs>
+          <w:tab w:val="num" w:pos="3600"/>
+        </w:tabs>
+        <w:ind w:left="3600" w:hanging="360"/>
+      </w:pPr>
+    </w:lvl>
+    <w:lvl w:ilvl="5" w:tentative="1">
+      <w:start w:val="1"/>
+      <w:numFmt w:val="decimal"/>
+      <w:lvlText w:val="%6."/>
+      <w:lvlJc w:val="left"/>
+      <w:pPr>
+        <w:tabs>
+          <w:tab w:val="num" w:pos="4320"/>
+        </w:tabs>
+        <w:ind w:left="4320" w:hanging="360"/>
+      </w:pPr>
+    </w:lvl>
+    <w:lvl w:ilvl="6" w:tentative="1">
+      <w:start w:val="1"/>
+      <w:numFmt w:val="decimal"/>
+      <w:lvlText w:val="%7."/>
+      <w:lvlJc w:val="left"/>
+      <w:pPr>
+        <w:tabs>
+          <w:tab w:val="num" w:pos="5040"/>
+        </w:tabs>
+        <w:ind w:left="5040" w:hanging="360"/>
+      </w:pPr>
+    </w:lvl>
+    <w:lvl w:ilvl="7" w:tentative="1">
+      <w:start w:val="1"/>
+      <w:numFmt w:val="decimal"/>
+      <w:lvlText w:val="%8."/>
+      <w:lvlJc w:val="left"/>
+      <w:pPr>
+        <w:tabs>
+          <w:tab w:val="num" w:pos="5760"/>
+        </w:tabs>
+        <w:ind w:left="5760" w:hanging="360"/>
+      </w:pPr>
+    </w:lvl>
+    <w:lvl w:ilvl="8" w:tentative="1">
+      <w:start w:val="1"/>
+      <w:numFmt w:val="decimal"/>
+      <w:lvlText w:val="%9."/>
+      <w:lvlJc w:val="left"/>
+      <w:pPr>
+        <w:tabs>
+          <w:tab w:val="num" w:pos="6480"/>
+        </w:tabs>
+        <w:ind w:left="6480" w:hanging="360"/>
+      </w:pPr>
+    </w:lvl>
+  </w:abstractNum>
+  <w:abstractNum w:abstractNumId="51" w15:restartNumberingAfterBreak="0">
     <w:nsid w:val="53F92F8B"/>
     <w:multiLevelType w:val="hybridMultilevel"/>
     <w:tmpl w:val="4552D1B2"/>
@@ -9423,7 +12081,7 @@
       </w:rPr>
     </w:lvl>
   </w:abstractNum>
-  <w:abstractNum w:abstractNumId="49" w15:restartNumberingAfterBreak="0">
+  <w:abstractNum w:abstractNumId="52" w15:restartNumberingAfterBreak="0">
     <w:nsid w:val="54213D11"/>
     <w:multiLevelType w:val="multilevel"/>
     <w:tmpl w:val="E94CA0FA"/>
@@ -9536,7 +12194,7 @@
       </w:pPr>
     </w:lvl>
   </w:abstractNum>
-  <w:abstractNum w:abstractNumId="50" w15:restartNumberingAfterBreak="0">
+  <w:abstractNum w:abstractNumId="53" w15:restartNumberingAfterBreak="0">
     <w:nsid w:val="57E40292"/>
     <w:multiLevelType w:val="multilevel"/>
     <w:tmpl w:val="AF26F93A"/>
@@ -9685,7 +12343,7 @@
       </w:rPr>
     </w:lvl>
   </w:abstractNum>
-  <w:abstractNum w:abstractNumId="51" w15:restartNumberingAfterBreak="0">
+  <w:abstractNum w:abstractNumId="54" w15:restartNumberingAfterBreak="0">
     <w:nsid w:val="5A2926AB"/>
     <w:multiLevelType w:val="hybridMultilevel"/>
     <w:tmpl w:val="74EAD57A"/>
@@ -9800,7 +12458,7 @@
       </w:rPr>
     </w:lvl>
   </w:abstractNum>
-  <w:abstractNum w:abstractNumId="52" w15:restartNumberingAfterBreak="0">
+  <w:abstractNum w:abstractNumId="55" w15:restartNumberingAfterBreak="0">
     <w:nsid w:val="5B26156C"/>
     <w:multiLevelType w:val="hybridMultilevel"/>
     <w:tmpl w:val="C656764A"/>
@@ -9892,7 +12550,7 @@
       </w:pPr>
     </w:lvl>
   </w:abstractNum>
-  <w:abstractNum w:abstractNumId="53" w15:restartNumberingAfterBreak="0">
+  <w:abstractNum w:abstractNumId="56" w15:restartNumberingAfterBreak="0">
     <w:nsid w:val="6174746A"/>
     <w:multiLevelType w:val="multilevel"/>
     <w:tmpl w:val="BDD8B1EE"/>
@@ -10041,7 +12699,7 @@
       </w:rPr>
     </w:lvl>
   </w:abstractNum>
-  <w:abstractNum w:abstractNumId="54" w15:restartNumberingAfterBreak="0">
+  <w:abstractNum w:abstractNumId="57" w15:restartNumberingAfterBreak="0">
     <w:nsid w:val="61D02171"/>
     <w:multiLevelType w:val="hybridMultilevel"/>
     <w:tmpl w:val="68700A82"/>
@@ -10154,7 +12812,7 @@
       </w:rPr>
     </w:lvl>
   </w:abstractNum>
-  <w:abstractNum w:abstractNumId="55" w15:restartNumberingAfterBreak="0">
+  <w:abstractNum w:abstractNumId="58" w15:restartNumberingAfterBreak="0">
     <w:nsid w:val="63406738"/>
     <w:multiLevelType w:val="multilevel"/>
     <w:tmpl w:val="16C24DA2"/>
@@ -10303,7 +12961,7 @@
       </w:rPr>
     </w:lvl>
   </w:abstractNum>
-  <w:abstractNum w:abstractNumId="56" w15:restartNumberingAfterBreak="0">
+  <w:abstractNum w:abstractNumId="59" w15:restartNumberingAfterBreak="0">
     <w:nsid w:val="658E3EBA"/>
     <w:multiLevelType w:val="multilevel"/>
     <w:tmpl w:val="3BA2066C"/>
@@ -10452,7 +13110,7 @@
       </w:rPr>
     </w:lvl>
   </w:abstractNum>
-  <w:abstractNum w:abstractNumId="57" w15:restartNumberingAfterBreak="0">
+  <w:abstractNum w:abstractNumId="60" w15:restartNumberingAfterBreak="0">
     <w:nsid w:val="66FE6E66"/>
     <w:multiLevelType w:val="hybridMultilevel"/>
     <w:tmpl w:val="040A30EC"/>
@@ -10565,7 +13223,7 @@
       </w:rPr>
     </w:lvl>
   </w:abstractNum>
-  <w:abstractNum w:abstractNumId="58" w15:restartNumberingAfterBreak="0">
+  <w:abstractNum w:abstractNumId="61" w15:restartNumberingAfterBreak="0">
     <w:nsid w:val="67DB023C"/>
     <w:multiLevelType w:val="hybridMultilevel"/>
     <w:tmpl w:val="02829B4A"/>
@@ -10657,7 +13315,7 @@
       </w:pPr>
     </w:lvl>
   </w:abstractNum>
-  <w:abstractNum w:abstractNumId="59" w15:restartNumberingAfterBreak="0">
+  <w:abstractNum w:abstractNumId="62" w15:restartNumberingAfterBreak="0">
     <w:nsid w:val="68A00AD0"/>
     <w:multiLevelType w:val="multilevel"/>
     <w:tmpl w:val="0CB4D606"/>
@@ -10806,7 +13464,7 @@
       </w:rPr>
     </w:lvl>
   </w:abstractNum>
-  <w:abstractNum w:abstractNumId="60" w15:restartNumberingAfterBreak="0">
+  <w:abstractNum w:abstractNumId="63" w15:restartNumberingAfterBreak="0">
     <w:nsid w:val="6B060B5F"/>
     <w:multiLevelType w:val="multilevel"/>
     <w:tmpl w:val="FD00A916"/>
@@ -10955,7 +13613,7 @@
       </w:rPr>
     </w:lvl>
   </w:abstractNum>
-  <w:abstractNum w:abstractNumId="61" w15:restartNumberingAfterBreak="0">
+  <w:abstractNum w:abstractNumId="64" w15:restartNumberingAfterBreak="0">
     <w:nsid w:val="6B1F4F44"/>
     <w:multiLevelType w:val="hybridMultilevel"/>
     <w:tmpl w:val="7F5EAAF0"/>
@@ -11047,7 +13705,241 @@
       </w:pPr>
     </w:lvl>
   </w:abstractNum>
-  <w:abstractNum w:abstractNumId="62" w15:restartNumberingAfterBreak="0">
+  <w:abstractNum w:abstractNumId="65" w15:restartNumberingAfterBreak="0">
+    <w:nsid w:val="6DEF3060"/>
+    <w:multiLevelType w:val="multilevel"/>
+    <w:tmpl w:val="200830F6"/>
+    <w:lvl w:ilvl="0">
+      <w:start w:val="1"/>
+      <w:numFmt w:val="decimal"/>
+      <w:lvlText w:val="%1."/>
+      <w:lvlJc w:val="left"/>
+      <w:pPr>
+        <w:tabs>
+          <w:tab w:val="num" w:pos="720"/>
+        </w:tabs>
+        <w:ind w:left="720" w:hanging="360"/>
+      </w:pPr>
+    </w:lvl>
+    <w:lvl w:ilvl="1">
+      <w:start w:val="1"/>
+      <w:numFmt w:val="bullet"/>
+      <w:lvlText w:val="o"/>
+      <w:lvlJc w:val="left"/>
+      <w:pPr>
+        <w:tabs>
+          <w:tab w:val="num" w:pos="1440"/>
+        </w:tabs>
+        <w:ind w:left="1440" w:hanging="360"/>
+      </w:pPr>
+      <w:rPr>
+        <w:rFonts w:ascii="Courier New" w:hAnsi="Courier New" w:hint="default"/>
+        <w:sz w:val="20"/>
+      </w:rPr>
+    </w:lvl>
+    <w:lvl w:ilvl="2" w:tentative="1">
+      <w:start w:val="1"/>
+      <w:numFmt w:val="decimal"/>
+      <w:lvlText w:val="%3."/>
+      <w:lvlJc w:val="left"/>
+      <w:pPr>
+        <w:tabs>
+          <w:tab w:val="num" w:pos="2160"/>
+        </w:tabs>
+        <w:ind w:left="2160" w:hanging="360"/>
+      </w:pPr>
+    </w:lvl>
+    <w:lvl w:ilvl="3" w:tentative="1">
+      <w:start w:val="1"/>
+      <w:numFmt w:val="decimal"/>
+      <w:lvlText w:val="%4."/>
+      <w:lvlJc w:val="left"/>
+      <w:pPr>
+        <w:tabs>
+          <w:tab w:val="num" w:pos="2880"/>
+        </w:tabs>
+        <w:ind w:left="2880" w:hanging="360"/>
+      </w:pPr>
+    </w:lvl>
+    <w:lvl w:ilvl="4" w:tentative="1">
+      <w:start w:val="1"/>
+      <w:numFmt w:val="decimal"/>
+      <w:lvlText w:val="%5."/>
+      <w:lvlJc w:val="left"/>
+      <w:pPr>
+        <w:tabs>
+          <w:tab w:val="num" w:pos="3600"/>
+        </w:tabs>
+        <w:ind w:left="3600" w:hanging="360"/>
+      </w:pPr>
+    </w:lvl>
+    <w:lvl w:ilvl="5" w:tentative="1">
+      <w:start w:val="1"/>
+      <w:numFmt w:val="decimal"/>
+      <w:lvlText w:val="%6."/>
+      <w:lvlJc w:val="left"/>
+      <w:pPr>
+        <w:tabs>
+          <w:tab w:val="num" w:pos="4320"/>
+        </w:tabs>
+        <w:ind w:left="4320" w:hanging="360"/>
+      </w:pPr>
+    </w:lvl>
+    <w:lvl w:ilvl="6" w:tentative="1">
+      <w:start w:val="1"/>
+      <w:numFmt w:val="decimal"/>
+      <w:lvlText w:val="%7."/>
+      <w:lvlJc w:val="left"/>
+      <w:pPr>
+        <w:tabs>
+          <w:tab w:val="num" w:pos="5040"/>
+        </w:tabs>
+        <w:ind w:left="5040" w:hanging="360"/>
+      </w:pPr>
+    </w:lvl>
+    <w:lvl w:ilvl="7" w:tentative="1">
+      <w:start w:val="1"/>
+      <w:numFmt w:val="decimal"/>
+      <w:lvlText w:val="%8."/>
+      <w:lvlJc w:val="left"/>
+      <w:pPr>
+        <w:tabs>
+          <w:tab w:val="num" w:pos="5760"/>
+        </w:tabs>
+        <w:ind w:left="5760" w:hanging="360"/>
+      </w:pPr>
+    </w:lvl>
+    <w:lvl w:ilvl="8" w:tentative="1">
+      <w:start w:val="1"/>
+      <w:numFmt w:val="decimal"/>
+      <w:lvlText w:val="%9."/>
+      <w:lvlJc w:val="left"/>
+      <w:pPr>
+        <w:tabs>
+          <w:tab w:val="num" w:pos="6480"/>
+        </w:tabs>
+        <w:ind w:left="6480" w:hanging="360"/>
+      </w:pPr>
+    </w:lvl>
+  </w:abstractNum>
+  <w:abstractNum w:abstractNumId="66" w15:restartNumberingAfterBreak="0">
+    <w:nsid w:val="6E7A0411"/>
+    <w:multiLevelType w:val="multilevel"/>
+    <w:tmpl w:val="8048C90A"/>
+    <w:lvl w:ilvl="0">
+      <w:start w:val="3"/>
+      <w:numFmt w:val="decimal"/>
+      <w:lvlText w:val="%1."/>
+      <w:lvlJc w:val="left"/>
+      <w:pPr>
+        <w:tabs>
+          <w:tab w:val="num" w:pos="720"/>
+        </w:tabs>
+        <w:ind w:left="720" w:hanging="360"/>
+      </w:pPr>
+    </w:lvl>
+    <w:lvl w:ilvl="1">
+      <w:start w:val="1"/>
+      <w:numFmt w:val="bullet"/>
+      <w:lvlText w:val="o"/>
+      <w:lvlJc w:val="left"/>
+      <w:pPr>
+        <w:tabs>
+          <w:tab w:val="num" w:pos="1440"/>
+        </w:tabs>
+        <w:ind w:left="1440" w:hanging="360"/>
+      </w:pPr>
+      <w:rPr>
+        <w:rFonts w:ascii="Courier New" w:hAnsi="Courier New" w:hint="default"/>
+        <w:sz w:val="20"/>
+      </w:rPr>
+    </w:lvl>
+    <w:lvl w:ilvl="2" w:tentative="1">
+      <w:start w:val="1"/>
+      <w:numFmt w:val="decimal"/>
+      <w:lvlText w:val="%3."/>
+      <w:lvlJc w:val="left"/>
+      <w:pPr>
+        <w:tabs>
+          <w:tab w:val="num" w:pos="2160"/>
+        </w:tabs>
+        <w:ind w:left="2160" w:hanging="360"/>
+      </w:pPr>
+    </w:lvl>
+    <w:lvl w:ilvl="3" w:tentative="1">
+      <w:start w:val="1"/>
+      <w:numFmt w:val="decimal"/>
+      <w:lvlText w:val="%4."/>
+      <w:lvlJc w:val="left"/>
+      <w:pPr>
+        <w:tabs>
+          <w:tab w:val="num" w:pos="2880"/>
+        </w:tabs>
+        <w:ind w:left="2880" w:hanging="360"/>
+      </w:pPr>
+    </w:lvl>
+    <w:lvl w:ilvl="4" w:tentative="1">
+      <w:start w:val="1"/>
+      <w:numFmt w:val="decimal"/>
+      <w:lvlText w:val="%5."/>
+      <w:lvlJc w:val="left"/>
+      <w:pPr>
+        <w:tabs>
+          <w:tab w:val="num" w:pos="3600"/>
+        </w:tabs>
+        <w:ind w:left="3600" w:hanging="360"/>
+      </w:pPr>
+    </w:lvl>
+    <w:lvl w:ilvl="5" w:tentative="1">
+      <w:start w:val="1"/>
+      <w:numFmt w:val="decimal"/>
+      <w:lvlText w:val="%6."/>
+      <w:lvlJc w:val="left"/>
+      <w:pPr>
+        <w:tabs>
+          <w:tab w:val="num" w:pos="4320"/>
+        </w:tabs>
+        <w:ind w:left="4320" w:hanging="360"/>
+      </w:pPr>
+    </w:lvl>
+    <w:lvl w:ilvl="6" w:tentative="1">
+      <w:start w:val="1"/>
+      <w:numFmt w:val="decimal"/>
+      <w:lvlText w:val="%7."/>
+      <w:lvlJc w:val="left"/>
+      <w:pPr>
+        <w:tabs>
+          <w:tab w:val="num" w:pos="5040"/>
+        </w:tabs>
+        <w:ind w:left="5040" w:hanging="360"/>
+      </w:pPr>
+    </w:lvl>
+    <w:lvl w:ilvl="7" w:tentative="1">
+      <w:start w:val="1"/>
+      <w:numFmt w:val="decimal"/>
+      <w:lvlText w:val="%8."/>
+      <w:lvlJc w:val="left"/>
+      <w:pPr>
+        <w:tabs>
+          <w:tab w:val="num" w:pos="5760"/>
+        </w:tabs>
+        <w:ind w:left="5760" w:hanging="360"/>
+      </w:pPr>
+    </w:lvl>
+    <w:lvl w:ilvl="8" w:tentative="1">
+      <w:start w:val="1"/>
+      <w:numFmt w:val="decimal"/>
+      <w:lvlText w:val="%9."/>
+      <w:lvlJc w:val="left"/>
+      <w:pPr>
+        <w:tabs>
+          <w:tab w:val="num" w:pos="6480"/>
+        </w:tabs>
+        <w:ind w:left="6480" w:hanging="360"/>
+      </w:pPr>
+    </w:lvl>
+  </w:abstractNum>
+  <w:abstractNum w:abstractNumId="67" w15:restartNumberingAfterBreak="0">
     <w:nsid w:val="70DF6CE3"/>
     <w:multiLevelType w:val="multilevel"/>
     <w:tmpl w:val="0CE62D24"/>
@@ -11196,7 +14088,7 @@
       </w:rPr>
     </w:lvl>
   </w:abstractNum>
-  <w:abstractNum w:abstractNumId="63" w15:restartNumberingAfterBreak="0">
+  <w:abstractNum w:abstractNumId="68" w15:restartNumberingAfterBreak="0">
     <w:nsid w:val="71F63E9F"/>
     <w:multiLevelType w:val="multilevel"/>
     <w:tmpl w:val="2FC86312"/>
@@ -11345,7 +14237,7 @@
       </w:rPr>
     </w:lvl>
   </w:abstractNum>
-  <w:abstractNum w:abstractNumId="64" w15:restartNumberingAfterBreak="0">
+  <w:abstractNum w:abstractNumId="69" w15:restartNumberingAfterBreak="0">
     <w:nsid w:val="754827CE"/>
     <w:multiLevelType w:val="multilevel"/>
     <w:tmpl w:val="8E385B5A"/>
@@ -11494,7 +14386,7 @@
       </w:rPr>
     </w:lvl>
   </w:abstractNum>
-  <w:abstractNum w:abstractNumId="65" w15:restartNumberingAfterBreak="0">
+  <w:abstractNum w:abstractNumId="70" w15:restartNumberingAfterBreak="0">
     <w:nsid w:val="76310C38"/>
     <w:multiLevelType w:val="multilevel"/>
     <w:tmpl w:val="FC18C478"/>
@@ -11643,7 +14535,124 @@
       </w:rPr>
     </w:lvl>
   </w:abstractNum>
-  <w:abstractNum w:abstractNumId="66" w15:restartNumberingAfterBreak="0">
+  <w:abstractNum w:abstractNumId="71" w15:restartNumberingAfterBreak="0">
+    <w:nsid w:val="765A3474"/>
+    <w:multiLevelType w:val="multilevel"/>
+    <w:tmpl w:val="292CD19E"/>
+    <w:lvl w:ilvl="0">
+      <w:start w:val="1"/>
+      <w:numFmt w:val="decimal"/>
+      <w:lvlText w:val="%1."/>
+      <w:lvlJc w:val="left"/>
+      <w:pPr>
+        <w:tabs>
+          <w:tab w:val="num" w:pos="720"/>
+        </w:tabs>
+        <w:ind w:left="720" w:hanging="360"/>
+      </w:pPr>
+    </w:lvl>
+    <w:lvl w:ilvl="1">
+      <w:start w:val="1"/>
+      <w:numFmt w:val="bullet"/>
+      <w:lvlText w:val="o"/>
+      <w:lvlJc w:val="left"/>
+      <w:pPr>
+        <w:tabs>
+          <w:tab w:val="num" w:pos="1440"/>
+        </w:tabs>
+        <w:ind w:left="1440" w:hanging="360"/>
+      </w:pPr>
+      <w:rPr>
+        <w:rFonts w:ascii="Courier New" w:hAnsi="Courier New" w:hint="default"/>
+        <w:sz w:val="20"/>
+      </w:rPr>
+    </w:lvl>
+    <w:lvl w:ilvl="2" w:tentative="1">
+      <w:start w:val="1"/>
+      <w:numFmt w:val="decimal"/>
+      <w:lvlText w:val="%3."/>
+      <w:lvlJc w:val="left"/>
+      <w:pPr>
+        <w:tabs>
+          <w:tab w:val="num" w:pos="2160"/>
+        </w:tabs>
+        <w:ind w:left="2160" w:hanging="360"/>
+      </w:pPr>
+    </w:lvl>
+    <w:lvl w:ilvl="3" w:tentative="1">
+      <w:start w:val="1"/>
+      <w:numFmt w:val="decimal"/>
+      <w:lvlText w:val="%4."/>
+      <w:lvlJc w:val="left"/>
+      <w:pPr>
+        <w:tabs>
+          <w:tab w:val="num" w:pos="2880"/>
+        </w:tabs>
+        <w:ind w:left="2880" w:hanging="360"/>
+      </w:pPr>
+    </w:lvl>
+    <w:lvl w:ilvl="4" w:tentative="1">
+      <w:start w:val="1"/>
+      <w:numFmt w:val="decimal"/>
+      <w:lvlText w:val="%5."/>
+      <w:lvlJc w:val="left"/>
+      <w:pPr>
+        <w:tabs>
+          <w:tab w:val="num" w:pos="3600"/>
+        </w:tabs>
+        <w:ind w:left="3600" w:hanging="360"/>
+      </w:pPr>
+    </w:lvl>
+    <w:lvl w:ilvl="5" w:tentative="1">
+      <w:start w:val="1"/>
+      <w:numFmt w:val="decimal"/>
+      <w:lvlText w:val="%6."/>
+      <w:lvlJc w:val="left"/>
+      <w:pPr>
+        <w:tabs>
+          <w:tab w:val="num" w:pos="4320"/>
+        </w:tabs>
+        <w:ind w:left="4320" w:hanging="360"/>
+      </w:pPr>
+    </w:lvl>
+    <w:lvl w:ilvl="6" w:tentative="1">
+      <w:start w:val="1"/>
+      <w:numFmt w:val="decimal"/>
+      <w:lvlText w:val="%7."/>
+      <w:lvlJc w:val="left"/>
+      <w:pPr>
+        <w:tabs>
+          <w:tab w:val="num" w:pos="5040"/>
+        </w:tabs>
+        <w:ind w:left="5040" w:hanging="360"/>
+      </w:pPr>
+    </w:lvl>
+    <w:lvl w:ilvl="7" w:tentative="1">
+      <w:start w:val="1"/>
+      <w:numFmt w:val="decimal"/>
+      <w:lvlText w:val="%8."/>
+      <w:lvlJc w:val="left"/>
+      <w:pPr>
+        <w:tabs>
+          <w:tab w:val="num" w:pos="5760"/>
+        </w:tabs>
+        <w:ind w:left="5760" w:hanging="360"/>
+      </w:pPr>
+    </w:lvl>
+    <w:lvl w:ilvl="8" w:tentative="1">
+      <w:start w:val="1"/>
+      <w:numFmt w:val="decimal"/>
+      <w:lvlText w:val="%9."/>
+      <w:lvlJc w:val="left"/>
+      <w:pPr>
+        <w:tabs>
+          <w:tab w:val="num" w:pos="6480"/>
+        </w:tabs>
+        <w:ind w:left="6480" w:hanging="360"/>
+      </w:pPr>
+    </w:lvl>
+  </w:abstractNum>
+  <w:abstractNum w:abstractNumId="72" w15:restartNumberingAfterBreak="0">
     <w:nsid w:val="77961309"/>
     <w:multiLevelType w:val="hybridMultilevel"/>
     <w:tmpl w:val="C656764A"/>
@@ -11735,7 +14744,156 @@
       </w:pPr>
     </w:lvl>
   </w:abstractNum>
-  <w:abstractNum w:abstractNumId="67" w15:restartNumberingAfterBreak="0">
+  <w:abstractNum w:abstractNumId="73" w15:restartNumberingAfterBreak="0">
+    <w:nsid w:val="7B497E62"/>
+    <w:multiLevelType w:val="multilevel"/>
+    <w:tmpl w:val="796A3240"/>
+    <w:lvl w:ilvl="0">
+      <w:start w:val="1"/>
+      <w:numFmt w:val="bullet"/>
+      <w:lvlText w:val=""/>
+      <w:lvlJc w:val="left"/>
+      <w:pPr>
+        <w:tabs>
+          <w:tab w:val="num" w:pos="720"/>
+        </w:tabs>
+        <w:ind w:left="720" w:hanging="360"/>
+      </w:pPr>
+      <w:rPr>
+        <w:rFonts w:ascii="Symbol" w:hAnsi="Symbol" w:hint="default"/>
+        <w:sz w:val="20"/>
+      </w:rPr>
+    </w:lvl>
+    <w:lvl w:ilvl="1" w:tentative="1">
+      <w:start w:val="1"/>
+      <w:numFmt w:val="bullet"/>
+      <w:lvlText w:val="o"/>
+      <w:lvlJc w:val="left"/>
+      <w:pPr>
+        <w:tabs>
+          <w:tab w:val="num" w:pos="1440"/>
+        </w:tabs>
+        <w:ind w:left="1440" w:hanging="360"/>
+      </w:pPr>
+      <w:rPr>
+        <w:rFonts w:ascii="Courier New" w:hAnsi="Courier New" w:hint="default"/>
+        <w:sz w:val="20"/>
+      </w:rPr>
+    </w:lvl>
+    <w:lvl w:ilvl="2" w:tentative="1">
+      <w:start w:val="1"/>
+      <w:numFmt w:val="bullet"/>
+      <w:lvlText w:val=""/>
+      <w:lvlJc w:val="left"/>
+      <w:pPr>
+        <w:tabs>
+          <w:tab w:val="num" w:pos="2160"/>
+        </w:tabs>
+        <w:ind w:left="2160" w:hanging="360"/>
+      </w:pPr>
+      <w:rPr>
+        <w:rFonts w:ascii="Wingdings" w:hAnsi="Wingdings" w:hint="default"/>
+        <w:sz w:val="20"/>
+      </w:rPr>
+    </w:lvl>
+    <w:lvl w:ilvl="3" w:tentative="1">
+      <w:start w:val="1"/>
+      <w:numFmt w:val="bullet"/>
+      <w:lvlText w:val=""/>
+      <w:lvlJc w:val="left"/>
+      <w:pPr>
+        <w:tabs>
+          <w:tab w:val="num" w:pos="2880"/>
+        </w:tabs>
+        <w:ind w:left="2880" w:hanging="360"/>
+      </w:pPr>
+      <w:rPr>
+        <w:rFonts w:ascii="Wingdings" w:hAnsi="Wingdings" w:hint="default"/>
+        <w:sz w:val="20"/>
+      </w:rPr>
+    </w:lvl>
+    <w:lvl w:ilvl="4" w:tentative="1">
+      <w:start w:val="1"/>
+      <w:numFmt w:val="bullet"/>
+      <w:lvlText w:val=""/>
+      <w:lvlJc w:val="left"/>
+      <w:pPr>
+        <w:tabs>
+          <w:tab w:val="num" w:pos="3600"/>
+        </w:tabs>
+        <w:ind w:left="3600" w:hanging="360"/>
+      </w:pPr>
+      <w:rPr>
+        <w:rFonts w:ascii="Wingdings" w:hAnsi="Wingdings" w:hint="default"/>
+        <w:sz w:val="20"/>
+      </w:rPr>
+    </w:lvl>
+    <w:lvl w:ilvl="5" w:tentative="1">
+      <w:start w:val="1"/>
+      <w:numFmt w:val="bullet"/>
+      <w:lvlText w:val=""/>
+      <w:lvlJc w:val="left"/>
+      <w:pPr>
+        <w:tabs>
+          <w:tab w:val="num" w:pos="4320"/>
+        </w:tabs>
+        <w:ind w:left="4320" w:hanging="360"/>
+      </w:pPr>
+      <w:rPr>
+        <w:rFonts w:ascii="Wingdings" w:hAnsi="Wingdings" w:hint="default"/>
+        <w:sz w:val="20"/>
+      </w:rPr>
+    </w:lvl>
+    <w:lvl w:ilvl="6" w:tentative="1">
+      <w:start w:val="1"/>
+      <w:numFmt w:val="bullet"/>
+      <w:lvlText w:val=""/>
+      <w:lvlJc w:val="left"/>
+      <w:pPr>
+        <w:tabs>
+          <w:tab w:val="num" w:pos="5040"/>
+        </w:tabs>
+        <w:ind w:left="5040" w:hanging="360"/>
+      </w:pPr>
+      <w:rPr>
+        <w:rFonts w:ascii="Wingdings" w:hAnsi="Wingdings" w:hint="default"/>
+        <w:sz w:val="20"/>
+      </w:rPr>
+    </w:lvl>
+    <w:lvl w:ilvl="7" w:tentative="1">
+      <w:start w:val="1"/>
+      <w:numFmt w:val="bullet"/>
+      <w:lvlText w:val=""/>
+      <w:lvlJc w:val="left"/>
+      <w:pPr>
+        <w:tabs>
+          <w:tab w:val="num" w:pos="5760"/>
+        </w:tabs>
+        <w:ind w:left="5760" w:hanging="360"/>
+      </w:pPr>
+      <w:rPr>
+        <w:rFonts w:ascii="Wingdings" w:hAnsi="Wingdings" w:hint="default"/>
+        <w:sz w:val="20"/>
+      </w:rPr>
+    </w:lvl>
+    <w:lvl w:ilvl="8" w:tentative="1">
+      <w:start w:val="1"/>
+      <w:numFmt w:val="bullet"/>
+      <w:lvlText w:val=""/>
+      <w:lvlJc w:val="left"/>
+      <w:pPr>
+        <w:tabs>
+          <w:tab w:val="num" w:pos="6480"/>
+        </w:tabs>
+        <w:ind w:left="6480" w:hanging="360"/>
+      </w:pPr>
+      <w:rPr>
+        <w:rFonts w:ascii="Wingdings" w:hAnsi="Wingdings" w:hint="default"/>
+        <w:sz w:val="20"/>
+      </w:rPr>
+    </w:lvl>
+  </w:abstractNum>
+  <w:abstractNum w:abstractNumId="74" w15:restartNumberingAfterBreak="0">
     <w:nsid w:val="7D101D07"/>
     <w:multiLevelType w:val="hybridMultilevel"/>
     <w:tmpl w:val="79DC4B2A"/>
@@ -11825,16 +14983,16 @@
     </w:lvl>
   </w:abstractNum>
   <w:num w:numId="1" w16cid:durableId="1148284549">
-    <w:abstractNumId w:val="46"/>
+    <w:abstractNumId w:val="48"/>
   </w:num>
   <w:num w:numId="2" w16cid:durableId="1945189640">
-    <w:abstractNumId w:val="61"/>
+    <w:abstractNumId w:val="64"/>
   </w:num>
   <w:num w:numId="3" w16cid:durableId="7100296">
-    <w:abstractNumId w:val="30"/>
+    <w:abstractNumId w:val="31"/>
   </w:num>
   <w:num w:numId="4" w16cid:durableId="1023435024">
-    <w:abstractNumId w:val="41"/>
+    <w:abstractNumId w:val="42"/>
   </w:num>
   <w:num w:numId="5" w16cid:durableId="1561015703">
     <w:abstractNumId w:val="19"/>
@@ -11843,16 +15001,16 @@
     <w:abstractNumId w:val="8"/>
   </w:num>
   <w:num w:numId="7" w16cid:durableId="191114812">
-    <w:abstractNumId w:val="58"/>
+    <w:abstractNumId w:val="61"/>
   </w:num>
   <w:num w:numId="8" w16cid:durableId="1120340569">
     <w:abstractNumId w:val="17"/>
   </w:num>
   <w:num w:numId="9" w16cid:durableId="513112351">
-    <w:abstractNumId w:val="66"/>
+    <w:abstractNumId w:val="72"/>
   </w:num>
   <w:num w:numId="10" w16cid:durableId="1771925205">
-    <w:abstractNumId w:val="52"/>
+    <w:abstractNumId w:val="55"/>
   </w:num>
   <w:num w:numId="11" w16cid:durableId="291786444">
     <w:abstractNumId w:val="4"/>
@@ -11861,49 +15019,49 @@
     <w:abstractNumId w:val="13"/>
   </w:num>
   <w:num w:numId="13" w16cid:durableId="1267738114">
-    <w:abstractNumId w:val="26"/>
+    <w:abstractNumId w:val="27"/>
   </w:num>
   <w:num w:numId="14" w16cid:durableId="1015621345">
-    <w:abstractNumId w:val="40"/>
+    <w:abstractNumId w:val="41"/>
   </w:num>
   <w:num w:numId="15" w16cid:durableId="891111860">
-    <w:abstractNumId w:val="33"/>
+    <w:abstractNumId w:val="34"/>
   </w:num>
   <w:num w:numId="16" w16cid:durableId="143090489">
     <w:abstractNumId w:val="7"/>
   </w:num>
   <w:num w:numId="17" w16cid:durableId="377365966">
-    <w:abstractNumId w:val="44"/>
+    <w:abstractNumId w:val="46"/>
   </w:num>
   <w:num w:numId="18" w16cid:durableId="2101481086">
-    <w:abstractNumId w:val="67"/>
+    <w:abstractNumId w:val="74"/>
   </w:num>
   <w:num w:numId="19" w16cid:durableId="458570854">
     <w:abstractNumId w:val="11"/>
   </w:num>
   <w:num w:numId="20" w16cid:durableId="1404644989">
-    <w:abstractNumId w:val="48"/>
+    <w:abstractNumId w:val="51"/>
   </w:num>
   <w:num w:numId="21" w16cid:durableId="1194734545">
     <w:abstractNumId w:val="16"/>
   </w:num>
   <w:num w:numId="22" w16cid:durableId="197789046">
-    <w:abstractNumId w:val="35"/>
+    <w:abstractNumId w:val="36"/>
   </w:num>
   <w:num w:numId="23" w16cid:durableId="1618950225">
-    <w:abstractNumId w:val="37"/>
+    <w:abstractNumId w:val="38"/>
   </w:num>
   <w:num w:numId="24" w16cid:durableId="442505100">
-    <w:abstractNumId w:val="32"/>
+    <w:abstractNumId w:val="33"/>
   </w:num>
   <w:num w:numId="25" w16cid:durableId="1094286349">
-    <w:abstractNumId w:val="36"/>
+    <w:abstractNumId w:val="37"/>
   </w:num>
   <w:num w:numId="26" w16cid:durableId="1960910003">
     <w:abstractNumId w:val="9"/>
   </w:num>
   <w:num w:numId="27" w16cid:durableId="1175261508">
-    <w:abstractNumId w:val="54"/>
+    <w:abstractNumId w:val="57"/>
   </w:num>
   <w:num w:numId="28" w16cid:durableId="1166281429">
     <w:abstractNumId w:val="23"/>
@@ -11912,16 +15070,16 @@
     <w:abstractNumId w:val="6"/>
   </w:num>
   <w:num w:numId="30" w16cid:durableId="528032103">
-    <w:abstractNumId w:val="31"/>
+    <w:abstractNumId w:val="32"/>
   </w:num>
   <w:num w:numId="31" w16cid:durableId="1038244552">
     <w:abstractNumId w:val="5"/>
   </w:num>
   <w:num w:numId="32" w16cid:durableId="600721530">
-    <w:abstractNumId w:val="47"/>
+    <w:abstractNumId w:val="49"/>
   </w:num>
   <w:num w:numId="33" w16cid:durableId="1819807980">
-    <w:abstractNumId w:val="51"/>
+    <w:abstractNumId w:val="54"/>
   </w:num>
   <w:num w:numId="34" w16cid:durableId="1485464773">
     <w:abstractNumId w:val="3"/>
@@ -11936,10 +15094,10 @@
     <w:abstractNumId w:val="0"/>
   </w:num>
   <w:num w:numId="38" w16cid:durableId="1411538386">
-    <w:abstractNumId w:val="57"/>
+    <w:abstractNumId w:val="60"/>
   </w:num>
   <w:num w:numId="39" w16cid:durableId="155657158">
-    <w:abstractNumId w:val="47"/>
+    <w:abstractNumId w:val="49"/>
     <w:lvlOverride w:ilvl="0">
       <w:startOverride w:val="1"/>
     </w:lvlOverride>
@@ -11969,7 +15127,7 @@
     </w:lvlOverride>
   </w:num>
   <w:num w:numId="40" w16cid:durableId="1841001831">
-    <w:abstractNumId w:val="47"/>
+    <w:abstractNumId w:val="49"/>
     <w:lvlOverride w:ilvl="0">
       <w:startOverride w:val="1"/>
     </w:lvlOverride>
@@ -11999,7 +15157,7 @@
     </w:lvlOverride>
   </w:num>
   <w:num w:numId="41" w16cid:durableId="1533961353">
-    <w:abstractNumId w:val="47"/>
+    <w:abstractNumId w:val="49"/>
     <w:lvlOverride w:ilvl="0">
       <w:startOverride w:val="1"/>
     </w:lvlOverride>
@@ -12029,7 +15187,7 @@
     </w:lvlOverride>
   </w:num>
   <w:num w:numId="42" w16cid:durableId="615865119">
-    <w:abstractNumId w:val="47"/>
+    <w:abstractNumId w:val="49"/>
     <w:lvlOverride w:ilvl="0">
       <w:startOverride w:val="1"/>
     </w:lvlOverride>
@@ -12059,7 +15217,7 @@
     </w:lvlOverride>
   </w:num>
   <w:num w:numId="43" w16cid:durableId="1194071254">
-    <w:abstractNumId w:val="47"/>
+    <w:abstractNumId w:val="49"/>
     <w:lvlOverride w:ilvl="0">
       <w:startOverride w:val="1"/>
     </w:lvlOverride>
@@ -12089,7 +15247,7 @@
     </w:lvlOverride>
   </w:num>
   <w:num w:numId="44" w16cid:durableId="1586497386">
-    <w:abstractNumId w:val="47"/>
+    <w:abstractNumId w:val="49"/>
     <w:lvlOverride w:ilvl="0">
       <w:startOverride w:val="1"/>
     </w:lvlOverride>
@@ -12119,7 +15277,7 @@
     </w:lvlOverride>
   </w:num>
   <w:num w:numId="45" w16cid:durableId="731387659">
-    <w:abstractNumId w:val="47"/>
+    <w:abstractNumId w:val="49"/>
     <w:lvlOverride w:ilvl="0">
       <w:startOverride w:val="1"/>
     </w:lvlOverride>
@@ -12149,49 +15307,49 @@
     </w:lvlOverride>
   </w:num>
   <w:num w:numId="46" w16cid:durableId="526913098">
+    <w:abstractNumId w:val="29"/>
+  </w:num>
+  <w:num w:numId="47" w16cid:durableId="116604947">
+    <w:abstractNumId w:val="52"/>
+  </w:num>
+  <w:num w:numId="48" w16cid:durableId="1080521072">
+    <w:abstractNumId w:val="56"/>
+  </w:num>
+  <w:num w:numId="49" w16cid:durableId="568852954">
     <w:abstractNumId w:val="28"/>
   </w:num>
-  <w:num w:numId="47" w16cid:durableId="116604947">
-    <w:abstractNumId w:val="49"/>
-  </w:num>
-  <w:num w:numId="48" w16cid:durableId="1080521072">
-    <w:abstractNumId w:val="53"/>
-  </w:num>
-  <w:num w:numId="49" w16cid:durableId="568852954">
-    <w:abstractNumId w:val="27"/>
-  </w:num>
   <w:num w:numId="50" w16cid:durableId="322247538">
-    <w:abstractNumId w:val="29"/>
+    <w:abstractNumId w:val="30"/>
   </w:num>
   <w:num w:numId="51" w16cid:durableId="31923312">
     <w:abstractNumId w:val="15"/>
   </w:num>
   <w:num w:numId="52" w16cid:durableId="957177433">
-    <w:abstractNumId w:val="34"/>
+    <w:abstractNumId w:val="35"/>
   </w:num>
   <w:num w:numId="53" w16cid:durableId="470100522">
-    <w:abstractNumId w:val="39"/>
+    <w:abstractNumId w:val="40"/>
   </w:num>
   <w:num w:numId="54" w16cid:durableId="1683319547">
-    <w:abstractNumId w:val="50"/>
+    <w:abstractNumId w:val="53"/>
   </w:num>
   <w:num w:numId="55" w16cid:durableId="1270313131">
-    <w:abstractNumId w:val="56"/>
+    <w:abstractNumId w:val="59"/>
   </w:num>
   <w:num w:numId="56" w16cid:durableId="1446074910">
     <w:abstractNumId w:val="20"/>
   </w:num>
   <w:num w:numId="57" w16cid:durableId="1774401416">
-    <w:abstractNumId w:val="65"/>
+    <w:abstractNumId w:val="70"/>
   </w:num>
   <w:num w:numId="58" w16cid:durableId="839659691">
     <w:abstractNumId w:val="18"/>
   </w:num>
   <w:num w:numId="59" w16cid:durableId="1170950028">
-    <w:abstractNumId w:val="38"/>
+    <w:abstractNumId w:val="39"/>
   </w:num>
   <w:num w:numId="60" w16cid:durableId="2139029997">
-    <w:abstractNumId w:val="24"/>
+    <w:abstractNumId w:val="25"/>
   </w:num>
   <w:num w:numId="61" w16cid:durableId="750155323">
     <w:abstractNumId w:val="10"/>
@@ -12206,37 +15364,58 @@
     <w:abstractNumId w:val="12"/>
   </w:num>
   <w:num w:numId="65" w16cid:durableId="252133581">
-    <w:abstractNumId w:val="64"/>
+    <w:abstractNumId w:val="69"/>
   </w:num>
   <w:num w:numId="66" w16cid:durableId="1911882280">
-    <w:abstractNumId w:val="42"/>
+    <w:abstractNumId w:val="44"/>
   </w:num>
   <w:num w:numId="67" w16cid:durableId="1327123404">
-    <w:abstractNumId w:val="55"/>
+    <w:abstractNumId w:val="58"/>
   </w:num>
   <w:num w:numId="68" w16cid:durableId="236592969">
-    <w:abstractNumId w:val="25"/>
+    <w:abstractNumId w:val="26"/>
   </w:num>
   <w:num w:numId="69" w16cid:durableId="1049960295">
-    <w:abstractNumId w:val="45"/>
+    <w:abstractNumId w:val="47"/>
   </w:num>
   <w:num w:numId="70" w16cid:durableId="391277060">
-    <w:abstractNumId w:val="60"/>
+    <w:abstractNumId w:val="63"/>
   </w:num>
   <w:num w:numId="71" w16cid:durableId="2367769">
-    <w:abstractNumId w:val="63"/>
+    <w:abstractNumId w:val="68"/>
   </w:num>
   <w:num w:numId="72" w16cid:durableId="158472692">
-    <w:abstractNumId w:val="62"/>
+    <w:abstractNumId w:val="67"/>
   </w:num>
   <w:num w:numId="73" w16cid:durableId="2025669593">
-    <w:abstractNumId w:val="43"/>
+    <w:abstractNumId w:val="45"/>
   </w:num>
   <w:num w:numId="74" w16cid:durableId="176189273">
     <w:abstractNumId w:val="14"/>
   </w:num>
   <w:num w:numId="75" w16cid:durableId="364990480">
-    <w:abstractNumId w:val="59"/>
+    <w:abstractNumId w:val="62"/>
+  </w:num>
+  <w:num w:numId="76" w16cid:durableId="1716075085">
+    <w:abstractNumId w:val="65"/>
+  </w:num>
+  <w:num w:numId="77" w16cid:durableId="932592024">
+    <w:abstractNumId w:val="50"/>
+  </w:num>
+  <w:num w:numId="78" w16cid:durableId="184486217">
+    <w:abstractNumId w:val="43"/>
+  </w:num>
+  <w:num w:numId="79" w16cid:durableId="248732593">
+    <w:abstractNumId w:val="71"/>
+  </w:num>
+  <w:num w:numId="80" w16cid:durableId="268317919">
+    <w:abstractNumId w:val="66"/>
+  </w:num>
+  <w:num w:numId="81" w16cid:durableId="579826709">
+    <w:abstractNumId w:val="73"/>
+  </w:num>
+  <w:num w:numId="82" w16cid:durableId="856888141">
+    <w:abstractNumId w:val="24"/>
   </w:num>
   <w:numIdMacAtCleanup w:val="12"/>
 </w:numbering>
@@ -12737,7 +15916,6 @@
   <w:style w:type="character" w:default="1" w:styleId="DefaultParagraphFont">
     <w:name w:val="Default Paragraph Font"/>
     <w:uiPriority w:val="1"/>
-    <w:semiHidden/>
     <w:unhideWhenUsed/>
   </w:style>
   <w:style w:type="table" w:default="1" w:styleId="TableNormal">
@@ -13639,6 +16817,8 @@
   </w:compat>
   <w:rsids>
     <w:rsidRoot w:val="007D5CC9"/>
+    <w:rsid w:val="00155D89"/>
+    <w:rsid w:val="00586832"/>
     <w:rsid w:val="00603328"/>
     <w:rsid w:val="007D5CC9"/>
     <w:rsid w:val="00B402B7"/>
@@ -14321,20 +17501,18 @@
 </file>
 
 <file path=customXml/item1.xml><?xml version="1.0" encoding="utf-8"?>
-<?mso-contentType ?>
-<FormTemplates xmlns="http://schemas.microsoft.com/sharepoint/v3/contenttype/forms">
-  <Display>DocumentLibraryForm</Display>
-  <Edit>DocumentLibraryForm</Edit>
-  <New>DocumentLibraryForm</New>
-</FormTemplates>
+<CoverPageProperties xmlns="http://schemas.microsoft.com/office/2006/coverPageProps">
+  <PublishDate>Software Engineering Project</PublishDate>
+  <Abstract/>
+  <CompanyAddress/>
+  <CompanyPhone/>
+  <CompanyFax/>
+  <CompanyEmail/>
+</CoverPageProperties>
 </file>
 
 <file path=customXml/item2.xml><?xml version="1.0" encoding="utf-8"?>
-<p:properties xmlns:p="http://schemas.microsoft.com/office/2006/metadata/properties" xmlns:xsi="http://www.w3.org/2001/XMLSchema-instance" xmlns:pc="http://schemas.microsoft.com/office/infopath/2007/PartnerControls">
-  <documentManagement>
-    <MediaServiceKeyPoints xmlns="71af3243-3dd4-4a8d-8c0d-dd76da1f02a5" xsi:nil="true"/>
-  </documentManagement>
-</p:properties>
+<b:Sources xmlns:b="http://schemas.openxmlformats.org/officeDocument/2006/bibliography" xmlns="http://schemas.openxmlformats.org/officeDocument/2006/bibliography" SelectedStyle="\APASixthEditionOfficeOnline.xsl" StyleName="APA" Version="6"/>
 </file>
 
 <file path=customXml/item3.xml><?xml version="1.0" encoding="utf-8"?>
@@ -14549,23 +17727,34 @@
 </file>
 
 <file path=customXml/item4.xml><?xml version="1.0" encoding="utf-8"?>
-<b:Sources xmlns:b="http://schemas.openxmlformats.org/officeDocument/2006/bibliography" xmlns="http://schemas.openxmlformats.org/officeDocument/2006/bibliography" SelectedStyle="\APASixthEditionOfficeOnline.xsl" StyleName="APA" Version="6"/>
+<p:properties xmlns:p="http://schemas.microsoft.com/office/2006/metadata/properties" xmlns:xsi="http://www.w3.org/2001/XMLSchema-instance" xmlns:pc="http://schemas.microsoft.com/office/infopath/2007/PartnerControls">
+  <documentManagement>
+    <MediaServiceKeyPoints xmlns="71af3243-3dd4-4a8d-8c0d-dd76da1f02a5" xsi:nil="true"/>
+  </documentManagement>
+</p:properties>
+</file>
+
+<file path=customXml/item5.xml><?xml version="1.0" encoding="utf-8"?>
+<?mso-contentType ?>
+<FormTemplates xmlns="http://schemas.microsoft.com/sharepoint/v3/contenttype/forms">
+  <Display>DocumentLibraryForm</Display>
+  <Edit>DocumentLibraryForm</Edit>
+  <New>DocumentLibraryForm</New>
+</FormTemplates>
 </file>
 
 <file path=customXml/itemProps1.xml><?xml version="1.0" encoding="utf-8"?>
-<ds:datastoreItem xmlns:ds="http://schemas.openxmlformats.org/officeDocument/2006/customXml" ds:itemID="{163BC185-8E20-4ACF-97AA-9CAB70B391C8}">
+<ds:datastoreItem xmlns:ds="http://schemas.openxmlformats.org/officeDocument/2006/customXml" ds:itemID="{55AF091B-3C7A-41E3-B477-F2FDAA23CFDA}">
   <ds:schemaRefs>
-    <ds:schemaRef ds:uri="http://schemas.microsoft.com/sharepoint/v3/contenttype/forms"/>
+    <ds:schemaRef ds:uri="http://schemas.microsoft.com/office/2006/coverPageProps"/>
   </ds:schemaRefs>
 </ds:datastoreItem>
 </file>
 
 <file path=customXml/itemProps2.xml><?xml version="1.0" encoding="utf-8"?>
-<ds:datastoreItem xmlns:ds="http://schemas.openxmlformats.org/officeDocument/2006/customXml" ds:itemID="{8E9D665E-9F2B-4523-84BE-A4382ED53113}">
+<ds:datastoreItem xmlns:ds="http://schemas.openxmlformats.org/officeDocument/2006/customXml" ds:itemID="{5F6DF1BE-4256-448F-A640-C9F03A0B7CCD}">
   <ds:schemaRefs>
-    <ds:schemaRef ds:uri="http://schemas.microsoft.com/office/2006/metadata/properties"/>
-    <ds:schemaRef ds:uri="http://schemas.microsoft.com/office/infopath/2007/PartnerControls"/>
-    <ds:schemaRef ds:uri="71af3243-3dd4-4a8d-8c0d-dd76da1f02a5"/>
+    <ds:schemaRef ds:uri="http://schemas.openxmlformats.org/officeDocument/2006/bibliography"/>
   </ds:schemaRefs>
 </ds:datastoreItem>
 </file>
@@ -14590,9 +17779,19 @@
 </file>
 
 <file path=customXml/itemProps4.xml><?xml version="1.0" encoding="utf-8"?>
-<ds:datastoreItem xmlns:ds="http://schemas.openxmlformats.org/officeDocument/2006/customXml" ds:itemID="{5F6DF1BE-4256-448F-A640-C9F03A0B7CCD}">
+<ds:datastoreItem xmlns:ds="http://schemas.openxmlformats.org/officeDocument/2006/customXml" ds:itemID="{8E9D665E-9F2B-4523-84BE-A4382ED53113}">
   <ds:schemaRefs>
-    <ds:schemaRef ds:uri="http://schemas.openxmlformats.org/officeDocument/2006/bibliography"/>
+    <ds:schemaRef ds:uri="http://schemas.microsoft.com/office/2006/metadata/properties"/>
+    <ds:schemaRef ds:uri="http://schemas.microsoft.com/office/infopath/2007/PartnerControls"/>
+    <ds:schemaRef ds:uri="71af3243-3dd4-4a8d-8c0d-dd76da1f02a5"/>
+  </ds:schemaRefs>
+</ds:datastoreItem>
+</file>
+
+<file path=customXml/itemProps5.xml><?xml version="1.0" encoding="utf-8"?>
+<ds:datastoreItem xmlns:ds="http://schemas.openxmlformats.org/officeDocument/2006/customXml" ds:itemID="{163BC185-8E20-4ACF-97AA-9CAB70B391C8}">
+  <ds:schemaRefs>
+    <ds:schemaRef ds:uri="http://schemas.microsoft.com/sharepoint/v3/contenttype/forms"/>
   </ds:schemaRefs>
 </ds:datastoreItem>
 </file>
</xml_diff>